<commit_message>
phase-1: update self-check report (docx) with full details
</commit_message>
<xml_diff>
--- a/docs/Phase1_自检报告.docx
+++ b/docs/Phase1_自检报告.docx
@@ -337,7 +337,63 @@
                 <w:sz w:val="20"/>
                 <w:szCs w:val="20"/>
               </w:rPr>
-              <w:t xml:space="preserve">github.com/carsonkeweishen-sketch/recruitment-dashboard-v3.git</w:t>
+              <w:t xml:space="preserve">github.com/carsonkeweishen-sketch/recruitment-dashboard-v3</w:t>
+            </w:r>
+          </w:p>
+        </w:tc>
+      </w:tr>
+      <w:tr>
+        <w:tc>
+          <w:tcPr>
+            <w:tcW w:type="dxa" w:w="3000"/>
+            <w:tcBorders>
+              <w:top w:val="single" w:color="CCCCCC" w:sz="1"/>
+              <w:left w:val="single" w:color="CCCCCC" w:sz="1"/>
+              <w:bottom w:val="single" w:color="CCCCCC" w:sz="1"/>
+              <w:right w:val="single" w:color="CCCCCC" w:sz="1"/>
+            </w:tcBorders>
+            <w:tcMar>
+              <w:top w:type="dxa" w:w="60"/>
+              <w:left w:type="dxa" w:w="100"/>
+              <w:bottom w:type="dxa" w:w="60"/>
+              <w:right w:type="dxa" w:w="100"/>
+            </w:tcMar>
+          </w:tcPr>
+          <w:p>
+            <w:r>
+              <w:rPr>
+                <w:rFonts w:ascii="Arial" w:cs="Arial" w:eastAsia="Arial" w:hAnsi="Arial"/>
+                <w:sz w:val="20"/>
+                <w:szCs w:val="20"/>
+              </w:rPr>
+              <w:t xml:space="preserve">本阶段目标</w:t>
+            </w:r>
+          </w:p>
+        </w:tc>
+        <w:tc>
+          <w:tcPr>
+            <w:tcW w:type="dxa" w:w="6026"/>
+            <w:tcBorders>
+              <w:top w:val="single" w:color="CCCCCC" w:sz="1"/>
+              <w:left w:val="single" w:color="CCCCCC" w:sz="1"/>
+              <w:bottom w:val="single" w:color="CCCCCC" w:sz="1"/>
+              <w:right w:val="single" w:color="CCCCCC" w:sz="1"/>
+            </w:tcBorders>
+            <w:tcMar>
+              <w:top w:type="dxa" w:w="60"/>
+              <w:left w:type="dxa" w:w="100"/>
+              <w:bottom w:type="dxa" w:w="60"/>
+              <w:right w:type="dxa" w:w="100"/>
+            </w:tcMar>
+          </w:tcPr>
+          <w:p>
+            <w:r>
+              <w:rPr>
+                <w:rFonts w:ascii="Arial" w:cs="Arial" w:eastAsia="Arial" w:hAnsi="Arial"/>
+                <w:sz w:val="20"/>
+                <w:szCs w:val="20"/>
+              </w:rPr>
+              <w:t xml:space="preserve">建立权限、角色、Scope 和系统边界基础</w:t>
             </w:r>
           </w:p>
         </w:tc>
@@ -573,7 +629,7 @@
                 <w:sz w:val="20"/>
                 <w:szCs w:val="20"/>
               </w:rPr>
-              <w:t xml:space="preserve">是否创建业务模块</w:t>
+              <w:t xml:space="preserve">是否创建业务模块（Jobs/Candidates 等）</w:t>
             </w:r>
           </w:p>
         </w:tc>
@@ -691,7 +747,7 @@
                 <w:sz w:val="20"/>
                 <w:szCs w:val="20"/>
               </w:rPr>
-              <w:t xml:space="preserve">是否接入 Moka</w:t>
+              <w:t xml:space="preserve">是否创建完整业务 Schema</w:t>
             </w:r>
           </w:p>
         </w:tc>
@@ -750,7 +806,125 @@
                 <w:sz w:val="20"/>
                 <w:szCs w:val="20"/>
               </w:rPr>
+              <w:t xml:space="preserve">是否接入 Moka</w:t>
+            </w:r>
+          </w:p>
+        </w:tc>
+        <w:tc>
+          <w:tcPr>
+            <w:tcW w:type="dxa" w:w="4513"/>
+            <w:tcBorders>
+              <w:top w:val="single" w:color="CCCCCC" w:sz="1"/>
+              <w:left w:val="single" w:color="CCCCCC" w:sz="1"/>
+              <w:bottom w:val="single" w:color="CCCCCC" w:sz="1"/>
+              <w:right w:val="single" w:color="CCCCCC" w:sz="1"/>
+            </w:tcBorders>
+            <w:tcMar>
+              <w:top w:type="dxa" w:w="60"/>
+              <w:left w:type="dxa" w:w="100"/>
+              <w:bottom w:type="dxa" w:w="60"/>
+              <w:right w:type="dxa" w:w="100"/>
+            </w:tcMar>
+          </w:tcPr>
+          <w:p>
+            <w:r>
+              <w:rPr>
+                <w:rFonts w:ascii="Arial" w:cs="Arial" w:eastAsia="Arial" w:hAnsi="Arial"/>
+                <w:b/>
+                <w:bCs/>
+                <w:color w:val="dc2626"/>
+                <w:sz w:val="20"/>
+                <w:szCs w:val="20"/>
+              </w:rPr>
+              <w:t xml:space="preserve">❌ FAIL</w:t>
+            </w:r>
+          </w:p>
+        </w:tc>
+      </w:tr>
+      <w:tr>
+        <w:tc>
+          <w:tcPr>
+            <w:tcW w:type="dxa" w:w="4513"/>
+            <w:tcBorders>
+              <w:top w:val="single" w:color="CCCCCC" w:sz="1"/>
+              <w:left w:val="single" w:color="CCCCCC" w:sz="1"/>
+              <w:bottom w:val="single" w:color="CCCCCC" w:sz="1"/>
+              <w:right w:val="single" w:color="CCCCCC" w:sz="1"/>
+            </w:tcBorders>
+            <w:tcMar>
+              <w:top w:type="dxa" w:w="60"/>
+              <w:left w:type="dxa" w:w="100"/>
+              <w:bottom w:type="dxa" w:w="60"/>
+              <w:right w:type="dxa" w:w="100"/>
+            </w:tcMar>
+          </w:tcPr>
+          <w:p>
+            <w:r>
+              <w:rPr>
+                <w:rFonts w:ascii="Arial" w:cs="Arial" w:eastAsia="Arial" w:hAnsi="Arial"/>
+                <w:sz w:val="20"/>
+                <w:szCs w:val="20"/>
+              </w:rPr>
               <w:t xml:space="preserve">是否使用真实候选人数据</w:t>
+            </w:r>
+          </w:p>
+        </w:tc>
+        <w:tc>
+          <w:tcPr>
+            <w:tcW w:type="dxa" w:w="4513"/>
+            <w:tcBorders>
+              <w:top w:val="single" w:color="CCCCCC" w:sz="1"/>
+              <w:left w:val="single" w:color="CCCCCC" w:sz="1"/>
+              <w:bottom w:val="single" w:color="CCCCCC" w:sz="1"/>
+              <w:right w:val="single" w:color="CCCCCC" w:sz="1"/>
+            </w:tcBorders>
+            <w:tcMar>
+              <w:top w:type="dxa" w:w="60"/>
+              <w:left w:type="dxa" w:w="100"/>
+              <w:bottom w:type="dxa" w:w="60"/>
+              <w:right w:type="dxa" w:w="100"/>
+            </w:tcMar>
+          </w:tcPr>
+          <w:p>
+            <w:r>
+              <w:rPr>
+                <w:rFonts w:ascii="Arial" w:cs="Arial" w:eastAsia="Arial" w:hAnsi="Arial"/>
+                <w:b/>
+                <w:bCs/>
+                <w:color w:val="dc2626"/>
+                <w:sz w:val="20"/>
+                <w:szCs w:val="20"/>
+              </w:rPr>
+              <w:t xml:space="preserve">❌ FAIL</w:t>
+            </w:r>
+          </w:p>
+        </w:tc>
+      </w:tr>
+      <w:tr>
+        <w:tc>
+          <w:tcPr>
+            <w:tcW w:type="dxa" w:w="4513"/>
+            <w:tcBorders>
+              <w:top w:val="single" w:color="CCCCCC" w:sz="1"/>
+              <w:left w:val="single" w:color="CCCCCC" w:sz="1"/>
+              <w:bottom w:val="single" w:color="CCCCCC" w:sz="1"/>
+              <w:right w:val="single" w:color="CCCCCC" w:sz="1"/>
+            </w:tcBorders>
+            <w:tcMar>
+              <w:top w:type="dxa" w:w="60"/>
+              <w:left w:type="dxa" w:w="100"/>
+              <w:bottom w:type="dxa" w:w="60"/>
+              <w:right w:type="dxa" w:w="100"/>
+            </w:tcMar>
+          </w:tcPr>
+          <w:p>
+            <w:r>
+              <w:rPr>
+                <w:rFonts w:ascii="Arial" w:cs="Arial" w:eastAsia="Arial" w:hAnsi="Arial"/>
+                <w:sz w:val="20"/>
+                <w:szCs w:val="20"/>
+              </w:rPr>
+              <w:t xml:space="preserve">是否复制 UI Kit 原始资产</w:t>
             </w:r>
           </w:p>
         </w:tc>
@@ -4979,7 +5153,7 @@
         <w:pStyle w:val="Heading2"/>
       </w:pPr>
       <w:r>
-        <w:t xml:space="preserve">八、新增文件清单</w:t>
+        <w:t xml:space="preserve">八、修改文件清单</w:t>
       </w:r>
     </w:p>
     <w:tbl>
@@ -5118,7 +5292,7 @@
                 <w:sz w:val="20"/>
                 <w:szCs w:val="20"/>
               </w:rPr>
-              <w:t xml:space="preserve">server/permissions/types.ts</w:t>
+              <w:t xml:space="preserve">components/layout/Sidebar.tsx</w:t>
             </w:r>
           </w:p>
         </w:tc>
@@ -5145,7 +5319,7 @@
                 <w:sz w:val="20"/>
                 <w:szCs w:val="20"/>
               </w:rPr>
-              <w:t xml:space="preserve">类型</w:t>
+              <w:t xml:space="preserve">组件</w:t>
             </w:r>
           </w:p>
         </w:tc>
@@ -5172,7 +5346,7 @@
                 <w:sz w:val="20"/>
                 <w:szCs w:val="20"/>
               </w:rPr>
-              <w:t xml:space="preserve">Role/Scope/Resource/Action 定义</w:t>
+              <w:t xml:space="preserve">添加权限调试入口 + Phase 状态</w:t>
             </w:r>
           </w:p>
         </w:tc>
@@ -5201,7 +5375,7 @@
                 <w:sz w:val="20"/>
                 <w:szCs w:val="20"/>
               </w:rPr>
-              <w:t xml:space="preserve">server/permissions/matrix.ts</w:t>
+              <w:t xml:space="preserve">components/layout/Topbar.tsx</w:t>
             </w:r>
           </w:p>
         </w:tc>
@@ -5228,7 +5402,7 @@
                 <w:sz w:val="20"/>
                 <w:szCs w:val="20"/>
               </w:rPr>
-              <w:t xml:space="preserve">逻辑</w:t>
+              <w:t xml:space="preserve">组件</w:t>
             </w:r>
           </w:p>
         </w:tc>
@@ -5255,7 +5429,7 @@
                 <w:sz w:val="20"/>
                 <w:szCs w:val="20"/>
               </w:rPr>
-              <w:t xml:space="preserve">13×6 权限矩阵 + hasPermission</w:t>
+              <w:t xml:space="preserve">集成 RoleSwitcher + Phase 状态</w:t>
             </w:r>
           </w:p>
         </w:tc>
@@ -5284,7 +5458,7 @@
                 <w:sz w:val="20"/>
                 <w:szCs w:val="20"/>
               </w:rPr>
-              <w:t xml:space="preserve">server/permissions/check-permission.ts</w:t>
+              <w:t xml:space="preserve">app/page.tsx</w:t>
             </w:r>
           </w:p>
         </w:tc>
@@ -5311,7 +5485,7 @@
                 <w:sz w:val="20"/>
                 <w:szCs w:val="20"/>
               </w:rPr>
-              <w:t xml:space="preserve">逻辑</w:t>
+              <w:t xml:space="preserve">页面</w:t>
             </w:r>
           </w:p>
         </w:tc>
@@ -5338,7 +5512,7 @@
                 <w:sz w:val="20"/>
                 <w:szCs w:val="20"/>
               </w:rPr>
-              <w:t xml:space="preserve">requirePermission + buildScopeWhere</w:t>
+              <w:t xml:space="preserve">Phase 状态三态 + 首页更新</w:t>
             </w:r>
           </w:p>
         </w:tc>
@@ -5367,7 +5541,7 @@
                 <w:sz w:val="20"/>
                 <w:szCs w:val="20"/>
               </w:rPr>
-              <w:t xml:space="preserve">server/auth/session.ts</w:t>
+              <w:t xml:space="preserve">docs/ROLE_PERMISSIONS.md</w:t>
             </w:r>
           </w:p>
         </w:tc>
@@ -5394,7 +5568,7 @@
                 <w:sz w:val="20"/>
                 <w:szCs w:val="20"/>
               </w:rPr>
-              <w:t xml:space="preserve">逻辑</w:t>
+              <w:t xml:space="preserve">文档</w:t>
             </w:r>
           </w:p>
         </w:tc>
@@ -5421,7 +5595,7 @@
                 <w:sz w:val="20"/>
                 <w:szCs w:val="20"/>
               </w:rPr>
-              <w:t xml:space="preserve">Cookie 开发态会话</w:t>
+              <w:t xml:space="preserve">完整权限矩阵 + 架构说明</w:t>
             </w:r>
           </w:p>
         </w:tc>
@@ -5450,7 +5624,7 @@
                 <w:sz w:val="20"/>
                 <w:szCs w:val="20"/>
               </w:rPr>
-              <w:t xml:space="preserve">components/auth/RoleSwitcher.tsx</w:t>
+              <w:t xml:space="preserve">docs/MOKA_BOUNDARY.md</w:t>
             </w:r>
           </w:p>
         </w:tc>
@@ -5477,7 +5651,7 @@
                 <w:sz w:val="20"/>
                 <w:szCs w:val="20"/>
               </w:rPr>
-              <w:t xml:space="preserve">组件</w:t>
+              <w:t xml:space="preserve">文档</w:t>
             </w:r>
           </w:p>
         </w:tc>
@@ -5504,7 +5678,7 @@
                 <w:sz w:val="20"/>
                 <w:szCs w:val="20"/>
               </w:rPr>
-              <w:t xml:space="preserve">角色切换下拉菜单</w:t>
+              <w:t xml:space="preserve">完整边界定义 + 安全规则</w:t>
             </w:r>
           </w:p>
         </w:tc>
@@ -5533,7 +5707,7 @@
                 <w:sz w:val="20"/>
                 <w:szCs w:val="20"/>
               </w:rPr>
-              <w:t xml:space="preserve">components/auth/PermissionGate.tsx</w:t>
+              <w:t xml:space="preserve">docs/ARCHITECTURE.md</w:t>
             </w:r>
           </w:p>
         </w:tc>
@@ -5560,7 +5734,7 @@
                 <w:sz w:val="20"/>
                 <w:szCs w:val="20"/>
               </w:rPr>
-              <w:t xml:space="preserve">组件</w:t>
+              <w:t xml:space="preserve">文档</w:t>
             </w:r>
           </w:p>
         </w:tc>
@@ -5587,7 +5761,7 @@
                 <w:sz w:val="20"/>
                 <w:szCs w:val="20"/>
               </w:rPr>
-              <w:t xml:space="preserve">权限门控</w:t>
+              <w:t xml:space="preserve">权限架构章节</w:t>
             </w:r>
           </w:p>
         </w:tc>
@@ -5616,7 +5790,7 @@
                 <w:sz w:val="20"/>
                 <w:szCs w:val="20"/>
               </w:rPr>
-              <w:t xml:space="preserve">app/api/auth/set-role/route.ts</w:t>
+              <w:t xml:space="preserve">docs/UI_GUIDELINES.md</w:t>
             </w:r>
           </w:p>
         </w:tc>
@@ -5643,7 +5817,7 @@
                 <w:sz w:val="20"/>
                 <w:szCs w:val="20"/>
               </w:rPr>
-              <w:t xml:space="preserve">API</w:t>
+              <w:t xml:space="preserve">文档</w:t>
             </w:r>
           </w:p>
         </w:tc>
@@ -5670,7 +5844,7 @@
                 <w:sz w:val="20"/>
                 <w:szCs w:val="20"/>
               </w:rPr>
-              <w:t xml:space="preserve">POST 设置角色</w:t>
+              <w:t xml:space="preserve">UI 设计方向 + 招聘业务映射</w:t>
             </w:r>
           </w:p>
         </w:tc>
@@ -5699,7 +5873,7 @@
                 <w:sz w:val="20"/>
                 <w:szCs w:val="20"/>
               </w:rPr>
-              <w:t xml:space="preserve">app/api/auth/context/route.ts</w:t>
+              <w:t xml:space="preserve">README.md</w:t>
             </w:r>
           </w:p>
         </w:tc>
@@ -5726,7 +5900,7 @@
                 <w:sz w:val="20"/>
                 <w:szCs w:val="20"/>
               </w:rPr>
-              <w:t xml:space="preserve">API</w:t>
+              <w:t xml:space="preserve">文档</w:t>
             </w:r>
           </w:p>
         </w:tc>
@@ -5753,7 +5927,7 @@
                 <w:sz w:val="20"/>
                 <w:szCs w:val="20"/>
               </w:rPr>
-              <w:t xml:space="preserve">GET 会话上下文</w:t>
+              <w:t xml:space="preserve">Phase 1 状态更新</w:t>
             </w:r>
           </w:p>
         </w:tc>
@@ -5782,7 +5956,7 @@
                 <w:sz w:val="20"/>
                 <w:szCs w:val="20"/>
               </w:rPr>
-              <w:t xml:space="preserve">app/api/permissions/route.ts</w:t>
+              <w:t xml:space="preserve">.gitignore</w:t>
             </w:r>
           </w:p>
         </w:tc>
@@ -5809,7 +5983,7 @@
                 <w:sz w:val="20"/>
                 <w:szCs w:val="20"/>
               </w:rPr>
-              <w:t xml:space="preserve">API</w:t>
+              <w:t xml:space="preserve">配置</w:t>
             </w:r>
           </w:p>
         </w:tc>
@@ -5836,173 +6010,7 @@
                 <w:sz w:val="20"/>
                 <w:szCs w:val="20"/>
               </w:rPr>
-              <w:t xml:space="preserve">GET 权限矩阵</w:t>
-            </w:r>
-          </w:p>
-        </w:tc>
-      </w:tr>
-      <w:tr>
-        <w:tc>
-          <w:tcPr>
-            <w:tcW w:type="dxa" w:w="3500"/>
-            <w:tcBorders>
-              <w:top w:val="single" w:color="CCCCCC" w:sz="1"/>
-              <w:left w:val="single" w:color="CCCCCC" w:sz="1"/>
-              <w:bottom w:val="single" w:color="CCCCCC" w:sz="1"/>
-              <w:right w:val="single" w:color="CCCCCC" w:sz="1"/>
-            </w:tcBorders>
-            <w:tcMar>
-              <w:top w:type="dxa" w:w="60"/>
-              <w:left w:type="dxa" w:w="100"/>
-              <w:bottom w:type="dxa" w:w="60"/>
-              <w:right w:type="dxa" w:w="100"/>
-            </w:tcMar>
-          </w:tcPr>
-          <w:p>
-            <w:r>
-              <w:rPr>
-                <w:rFonts w:ascii="Arial" w:cs="Arial" w:eastAsia="Arial" w:hAnsi="Arial"/>
-                <w:sz w:val="20"/>
-                <w:szCs w:val="20"/>
-              </w:rPr>
-              <w:t xml:space="preserve">app/permissions-debug/page.tsx</w:t>
-            </w:r>
-          </w:p>
-        </w:tc>
-        <w:tc>
-          <w:tcPr>
-            <w:tcW w:type="dxa" w:w="1500"/>
-            <w:tcBorders>
-              <w:top w:val="single" w:color="CCCCCC" w:sz="1"/>
-              <w:left w:val="single" w:color="CCCCCC" w:sz="1"/>
-              <w:bottom w:val="single" w:color="CCCCCC" w:sz="1"/>
-              <w:right w:val="single" w:color="CCCCCC" w:sz="1"/>
-            </w:tcBorders>
-            <w:tcMar>
-              <w:top w:type="dxa" w:w="60"/>
-              <w:left w:type="dxa" w:w="100"/>
-              <w:bottom w:type="dxa" w:w="60"/>
-              <w:right w:type="dxa" w:w="100"/>
-            </w:tcMar>
-          </w:tcPr>
-          <w:p>
-            <w:r>
-              <w:rPr>
-                <w:rFonts w:ascii="Arial" w:cs="Arial" w:eastAsia="Arial" w:hAnsi="Arial"/>
-                <w:sz w:val="20"/>
-                <w:szCs w:val="20"/>
-              </w:rPr>
-              <w:t xml:space="preserve">页面</w:t>
-            </w:r>
-          </w:p>
-        </w:tc>
-        <w:tc>
-          <w:tcPr>
-            <w:tcW w:type="dxa" w:w="4026"/>
-            <w:tcBorders>
-              <w:top w:val="single" w:color="CCCCCC" w:sz="1"/>
-              <w:left w:val="single" w:color="CCCCCC" w:sz="1"/>
-              <w:bottom w:val="single" w:color="CCCCCC" w:sz="1"/>
-              <w:right w:val="single" w:color="CCCCCC" w:sz="1"/>
-            </w:tcBorders>
-            <w:tcMar>
-              <w:top w:type="dxa" w:w="60"/>
-              <w:left w:type="dxa" w:w="100"/>
-              <w:bottom w:type="dxa" w:w="60"/>
-              <w:right w:type="dxa" w:w="100"/>
-            </w:tcMar>
-          </w:tcPr>
-          <w:p>
-            <w:r>
-              <w:rPr>
-                <w:rFonts w:ascii="Arial" w:cs="Arial" w:eastAsia="Arial" w:hAnsi="Arial"/>
-                <w:sz w:val="20"/>
-                <w:szCs w:val="20"/>
-              </w:rPr>
-              <w:t xml:space="preserve">权限调试面板</w:t>
-            </w:r>
-          </w:p>
-        </w:tc>
-      </w:tr>
-      <w:tr>
-        <w:tc>
-          <w:tcPr>
-            <w:tcW w:type="dxa" w:w="3500"/>
-            <w:tcBorders>
-              <w:top w:val="single" w:color="CCCCCC" w:sz="1"/>
-              <w:left w:val="single" w:color="CCCCCC" w:sz="1"/>
-              <w:bottom w:val="single" w:color="CCCCCC" w:sz="1"/>
-              <w:right w:val="single" w:color="CCCCCC" w:sz="1"/>
-            </w:tcBorders>
-            <w:tcMar>
-              <w:top w:type="dxa" w:w="60"/>
-              <w:left w:type="dxa" w:w="100"/>
-              <w:bottom w:type="dxa" w:w="60"/>
-              <w:right w:type="dxa" w:w="100"/>
-            </w:tcMar>
-          </w:tcPr>
-          <w:p>
-            <w:r>
-              <w:rPr>
-                <w:rFonts w:ascii="Arial" w:cs="Arial" w:eastAsia="Arial" w:hAnsi="Arial"/>
-                <w:sz w:val="20"/>
-                <w:szCs w:val="20"/>
-              </w:rPr>
-              <w:t xml:space="preserve">docs/domain/ (6 文件)</w:t>
-            </w:r>
-          </w:p>
-        </w:tc>
-        <w:tc>
-          <w:tcPr>
-            <w:tcW w:type="dxa" w:w="1500"/>
-            <w:tcBorders>
-              <w:top w:val="single" w:color="CCCCCC" w:sz="1"/>
-              <w:left w:val="single" w:color="CCCCCC" w:sz="1"/>
-              <w:bottom w:val="single" w:color="CCCCCC" w:sz="1"/>
-              <w:right w:val="single" w:color="CCCCCC" w:sz="1"/>
-            </w:tcBorders>
-            <w:tcMar>
-              <w:top w:type="dxa" w:w="60"/>
-              <w:left w:type="dxa" w:w="100"/>
-              <w:bottom w:type="dxa" w:w="60"/>
-              <w:right w:type="dxa" w:w="100"/>
-            </w:tcMar>
-          </w:tcPr>
-          <w:p>
-            <w:r>
-              <w:rPr>
-                <w:rFonts w:ascii="Arial" w:cs="Arial" w:eastAsia="Arial" w:hAnsi="Arial"/>
-                <w:sz w:val="20"/>
-                <w:szCs w:val="20"/>
-              </w:rPr>
-              <w:t xml:space="preserve">文档</w:t>
-            </w:r>
-          </w:p>
-        </w:tc>
-        <w:tc>
-          <w:tcPr>
-            <w:tcW w:type="dxa" w:w="4026"/>
-            <w:tcBorders>
-              <w:top w:val="single" w:color="CCCCCC" w:sz="1"/>
-              <w:left w:val="single" w:color="CCCCCC" w:sz="1"/>
-              <w:bottom w:val="single" w:color="CCCCCC" w:sz="1"/>
-              <w:right w:val="single" w:color="CCCCCC" w:sz="1"/>
-            </w:tcBorders>
-            <w:tcMar>
-              <w:top w:type="dxa" w:w="60"/>
-              <w:left w:type="dxa" w:w="100"/>
-              <w:bottom w:type="dxa" w:w="60"/>
-              <w:right w:type="dxa" w:w="100"/>
-            </w:tcMar>
-          </w:tcPr>
-          <w:p>
-            <w:r>
-              <w:rPr>
-                <w:rFonts w:ascii="Arial" w:cs="Arial" w:eastAsia="Arial" w:hAnsi="Arial"/>
-                <w:sz w:val="20"/>
-                <w:szCs w:val="20"/>
-              </w:rPr>
-              <w:t xml:space="preserve">理然业务规则骨架</w:t>
+              <w:t xml:space="preserve">新增 private-data/ + seed.internal.ts</w:t>
             </w:r>
           </w:p>
         </w:tc>
@@ -6013,7 +6021,2305 @@
         <w:pStyle w:val="Heading2"/>
       </w:pPr>
       <w:r>
-        <w:t xml:space="preserve">九、构建验证</w:t>
+        <w:t xml:space="preserve">九、新增文件清单</w:t>
+      </w:r>
+    </w:p>
+    <w:tbl>
+      <w:tblPr>
+        <w:tblW w:type="dxa" w:w="9026"/>
+        <w:tblBorders>
+          <w:top w:val="single" w:color="auto" w:sz="4"/>
+          <w:left w:val="single" w:color="auto" w:sz="4"/>
+          <w:bottom w:val="single" w:color="auto" w:sz="4"/>
+          <w:right w:val="single" w:color="auto" w:sz="4"/>
+          <w:insideH w:val="single" w:color="auto" w:sz="4"/>
+          <w:insideV w:val="single" w:color="auto" w:sz="4"/>
+        </w:tblBorders>
+      </w:tblPr>
+      <w:tblGrid>
+        <w:gridCol w:w="3500"/>
+        <w:gridCol w:w="1500"/>
+        <w:gridCol w:w="4026"/>
+      </w:tblGrid>
+      <w:tr>
+        <w:tc>
+          <w:tcPr>
+            <w:tcW w:type="dxa" w:w="3500"/>
+            <w:tcBorders>
+              <w:top w:val="single" w:color="CCCCCC" w:sz="1"/>
+              <w:left w:val="single" w:color="CCCCCC" w:sz="1"/>
+              <w:bottom w:val="single" w:color="CCCCCC" w:sz="1"/>
+              <w:right w:val="single" w:color="CCCCCC" w:sz="1"/>
+            </w:tcBorders>
+            <w:shd w:fill="2563eb" w:val="clear"/>
+            <w:tcMar>
+              <w:top w:type="dxa" w:w="60"/>
+              <w:left w:type="dxa" w:w="100"/>
+              <w:bottom w:type="dxa" w:w="60"/>
+              <w:right w:type="dxa" w:w="100"/>
+            </w:tcMar>
+          </w:tcPr>
+          <w:p>
+            <w:r>
+              <w:rPr>
+                <w:rFonts w:ascii="Arial" w:cs="Arial" w:eastAsia="Arial" w:hAnsi="Arial"/>
+                <w:b/>
+                <w:bCs/>
+                <w:color w:val="FFFFFF"/>
+                <w:sz w:val="20"/>
+                <w:szCs w:val="20"/>
+              </w:rPr>
+              <w:t xml:space="preserve">文件</w:t>
+            </w:r>
+          </w:p>
+        </w:tc>
+        <w:tc>
+          <w:tcPr>
+            <w:tcW w:type="dxa" w:w="1500"/>
+            <w:tcBorders>
+              <w:top w:val="single" w:color="CCCCCC" w:sz="1"/>
+              <w:left w:val="single" w:color="CCCCCC" w:sz="1"/>
+              <w:bottom w:val="single" w:color="CCCCCC" w:sz="1"/>
+              <w:right w:val="single" w:color="CCCCCC" w:sz="1"/>
+            </w:tcBorders>
+            <w:shd w:fill="2563eb" w:val="clear"/>
+            <w:tcMar>
+              <w:top w:type="dxa" w:w="60"/>
+              <w:left w:type="dxa" w:w="100"/>
+              <w:bottom w:type="dxa" w:w="60"/>
+              <w:right w:type="dxa" w:w="100"/>
+            </w:tcMar>
+          </w:tcPr>
+          <w:p>
+            <w:r>
+              <w:rPr>
+                <w:rFonts w:ascii="Arial" w:cs="Arial" w:eastAsia="Arial" w:hAnsi="Arial"/>
+                <w:b/>
+                <w:bCs/>
+                <w:color w:val="FFFFFF"/>
+                <w:sz w:val="20"/>
+                <w:szCs w:val="20"/>
+              </w:rPr>
+              <w:t xml:space="preserve">类型</w:t>
+            </w:r>
+          </w:p>
+        </w:tc>
+        <w:tc>
+          <w:tcPr>
+            <w:tcW w:type="dxa" w:w="4026"/>
+            <w:tcBorders>
+              <w:top w:val="single" w:color="CCCCCC" w:sz="1"/>
+              <w:left w:val="single" w:color="CCCCCC" w:sz="1"/>
+              <w:bottom w:val="single" w:color="CCCCCC" w:sz="1"/>
+              <w:right w:val="single" w:color="CCCCCC" w:sz="1"/>
+            </w:tcBorders>
+            <w:shd w:fill="2563eb" w:val="clear"/>
+            <w:tcMar>
+              <w:top w:type="dxa" w:w="60"/>
+              <w:left w:type="dxa" w:w="100"/>
+              <w:bottom w:type="dxa" w:w="60"/>
+              <w:right w:type="dxa" w:w="100"/>
+            </w:tcMar>
+          </w:tcPr>
+          <w:p>
+            <w:r>
+              <w:rPr>
+                <w:rFonts w:ascii="Arial" w:cs="Arial" w:eastAsia="Arial" w:hAnsi="Arial"/>
+                <w:b/>
+                <w:bCs/>
+                <w:color w:val="FFFFFF"/>
+                <w:sz w:val="20"/>
+                <w:szCs w:val="20"/>
+              </w:rPr>
+              <w:t xml:space="preserve">说明</w:t>
+            </w:r>
+          </w:p>
+        </w:tc>
+      </w:tr>
+      <w:tr>
+        <w:tc>
+          <w:tcPr>
+            <w:tcW w:type="dxa" w:w="3500"/>
+            <w:tcBorders>
+              <w:top w:val="single" w:color="CCCCCC" w:sz="1"/>
+              <w:left w:val="single" w:color="CCCCCC" w:sz="1"/>
+              <w:bottom w:val="single" w:color="CCCCCC" w:sz="1"/>
+              <w:right w:val="single" w:color="CCCCCC" w:sz="1"/>
+            </w:tcBorders>
+            <w:tcMar>
+              <w:top w:type="dxa" w:w="60"/>
+              <w:left w:type="dxa" w:w="100"/>
+              <w:bottom w:type="dxa" w:w="60"/>
+              <w:right w:type="dxa" w:w="100"/>
+            </w:tcMar>
+          </w:tcPr>
+          <w:p>
+            <w:r>
+              <w:rPr>
+                <w:rFonts w:ascii="Arial" w:cs="Arial" w:eastAsia="Arial" w:hAnsi="Arial"/>
+                <w:sz w:val="20"/>
+                <w:szCs w:val="20"/>
+              </w:rPr>
+              <w:t xml:space="preserve">server/permissions/types.ts</w:t>
+            </w:r>
+          </w:p>
+        </w:tc>
+        <w:tc>
+          <w:tcPr>
+            <w:tcW w:type="dxa" w:w="1500"/>
+            <w:tcBorders>
+              <w:top w:val="single" w:color="CCCCCC" w:sz="1"/>
+              <w:left w:val="single" w:color="CCCCCC" w:sz="1"/>
+              <w:bottom w:val="single" w:color="CCCCCC" w:sz="1"/>
+              <w:right w:val="single" w:color="CCCCCC" w:sz="1"/>
+            </w:tcBorders>
+            <w:tcMar>
+              <w:top w:type="dxa" w:w="60"/>
+              <w:left w:type="dxa" w:w="100"/>
+              <w:bottom w:type="dxa" w:w="60"/>
+              <w:right w:type="dxa" w:w="100"/>
+            </w:tcMar>
+          </w:tcPr>
+          <w:p>
+            <w:r>
+              <w:rPr>
+                <w:rFonts w:ascii="Arial" w:cs="Arial" w:eastAsia="Arial" w:hAnsi="Arial"/>
+                <w:sz w:val="20"/>
+                <w:szCs w:val="20"/>
+              </w:rPr>
+              <w:t xml:space="preserve">类型</w:t>
+            </w:r>
+          </w:p>
+        </w:tc>
+        <w:tc>
+          <w:tcPr>
+            <w:tcW w:type="dxa" w:w="4026"/>
+            <w:tcBorders>
+              <w:top w:val="single" w:color="CCCCCC" w:sz="1"/>
+              <w:left w:val="single" w:color="CCCCCC" w:sz="1"/>
+              <w:bottom w:val="single" w:color="CCCCCC" w:sz="1"/>
+              <w:right w:val="single" w:color="CCCCCC" w:sz="1"/>
+            </w:tcBorders>
+            <w:tcMar>
+              <w:top w:type="dxa" w:w="60"/>
+              <w:left w:type="dxa" w:w="100"/>
+              <w:bottom w:type="dxa" w:w="60"/>
+              <w:right w:type="dxa" w:w="100"/>
+            </w:tcMar>
+          </w:tcPr>
+          <w:p>
+            <w:r>
+              <w:rPr>
+                <w:rFonts w:ascii="Arial" w:cs="Arial" w:eastAsia="Arial" w:hAnsi="Arial"/>
+                <w:sz w:val="20"/>
+                <w:szCs w:val="20"/>
+              </w:rPr>
+              <w:t xml:space="preserve">Role/Scope/Resource/Action 定义</w:t>
+            </w:r>
+          </w:p>
+        </w:tc>
+      </w:tr>
+      <w:tr>
+        <w:tc>
+          <w:tcPr>
+            <w:tcW w:type="dxa" w:w="3500"/>
+            <w:tcBorders>
+              <w:top w:val="single" w:color="CCCCCC" w:sz="1"/>
+              <w:left w:val="single" w:color="CCCCCC" w:sz="1"/>
+              <w:bottom w:val="single" w:color="CCCCCC" w:sz="1"/>
+              <w:right w:val="single" w:color="CCCCCC" w:sz="1"/>
+            </w:tcBorders>
+            <w:tcMar>
+              <w:top w:type="dxa" w:w="60"/>
+              <w:left w:type="dxa" w:w="100"/>
+              <w:bottom w:type="dxa" w:w="60"/>
+              <w:right w:type="dxa" w:w="100"/>
+            </w:tcMar>
+          </w:tcPr>
+          <w:p>
+            <w:r>
+              <w:rPr>
+                <w:rFonts w:ascii="Arial" w:cs="Arial" w:eastAsia="Arial" w:hAnsi="Arial"/>
+                <w:sz w:val="20"/>
+                <w:szCs w:val="20"/>
+              </w:rPr>
+              <w:t xml:space="preserve">server/permissions/matrix.ts</w:t>
+            </w:r>
+          </w:p>
+        </w:tc>
+        <w:tc>
+          <w:tcPr>
+            <w:tcW w:type="dxa" w:w="1500"/>
+            <w:tcBorders>
+              <w:top w:val="single" w:color="CCCCCC" w:sz="1"/>
+              <w:left w:val="single" w:color="CCCCCC" w:sz="1"/>
+              <w:bottom w:val="single" w:color="CCCCCC" w:sz="1"/>
+              <w:right w:val="single" w:color="CCCCCC" w:sz="1"/>
+            </w:tcBorders>
+            <w:tcMar>
+              <w:top w:type="dxa" w:w="60"/>
+              <w:left w:type="dxa" w:w="100"/>
+              <w:bottom w:type="dxa" w:w="60"/>
+              <w:right w:type="dxa" w:w="100"/>
+            </w:tcMar>
+          </w:tcPr>
+          <w:p>
+            <w:r>
+              <w:rPr>
+                <w:rFonts w:ascii="Arial" w:cs="Arial" w:eastAsia="Arial" w:hAnsi="Arial"/>
+                <w:sz w:val="20"/>
+                <w:szCs w:val="20"/>
+              </w:rPr>
+              <w:t xml:space="preserve">逻辑</w:t>
+            </w:r>
+          </w:p>
+        </w:tc>
+        <w:tc>
+          <w:tcPr>
+            <w:tcW w:type="dxa" w:w="4026"/>
+            <w:tcBorders>
+              <w:top w:val="single" w:color="CCCCCC" w:sz="1"/>
+              <w:left w:val="single" w:color="CCCCCC" w:sz="1"/>
+              <w:bottom w:val="single" w:color="CCCCCC" w:sz="1"/>
+              <w:right w:val="single" w:color="CCCCCC" w:sz="1"/>
+            </w:tcBorders>
+            <w:tcMar>
+              <w:top w:type="dxa" w:w="60"/>
+              <w:left w:type="dxa" w:w="100"/>
+              <w:bottom w:type="dxa" w:w="60"/>
+              <w:right w:type="dxa" w:w="100"/>
+            </w:tcMar>
+          </w:tcPr>
+          <w:p>
+            <w:r>
+              <w:rPr>
+                <w:rFonts w:ascii="Arial" w:cs="Arial" w:eastAsia="Arial" w:hAnsi="Arial"/>
+                <w:sz w:val="20"/>
+                <w:szCs w:val="20"/>
+              </w:rPr>
+              <w:t xml:space="preserve">13×6 权限矩阵 + hasPermission</w:t>
+            </w:r>
+          </w:p>
+        </w:tc>
+      </w:tr>
+      <w:tr>
+        <w:tc>
+          <w:tcPr>
+            <w:tcW w:type="dxa" w:w="3500"/>
+            <w:tcBorders>
+              <w:top w:val="single" w:color="CCCCCC" w:sz="1"/>
+              <w:left w:val="single" w:color="CCCCCC" w:sz="1"/>
+              <w:bottom w:val="single" w:color="CCCCCC" w:sz="1"/>
+              <w:right w:val="single" w:color="CCCCCC" w:sz="1"/>
+            </w:tcBorders>
+            <w:tcMar>
+              <w:top w:type="dxa" w:w="60"/>
+              <w:left w:type="dxa" w:w="100"/>
+              <w:bottom w:type="dxa" w:w="60"/>
+              <w:right w:type="dxa" w:w="100"/>
+            </w:tcMar>
+          </w:tcPr>
+          <w:p>
+            <w:r>
+              <w:rPr>
+                <w:rFonts w:ascii="Arial" w:cs="Arial" w:eastAsia="Arial" w:hAnsi="Arial"/>
+                <w:sz w:val="20"/>
+                <w:szCs w:val="20"/>
+              </w:rPr>
+              <w:t xml:space="preserve">server/permissions/check-permission.ts</w:t>
+            </w:r>
+          </w:p>
+        </w:tc>
+        <w:tc>
+          <w:tcPr>
+            <w:tcW w:type="dxa" w:w="1500"/>
+            <w:tcBorders>
+              <w:top w:val="single" w:color="CCCCCC" w:sz="1"/>
+              <w:left w:val="single" w:color="CCCCCC" w:sz="1"/>
+              <w:bottom w:val="single" w:color="CCCCCC" w:sz="1"/>
+              <w:right w:val="single" w:color="CCCCCC" w:sz="1"/>
+            </w:tcBorders>
+            <w:tcMar>
+              <w:top w:type="dxa" w:w="60"/>
+              <w:left w:type="dxa" w:w="100"/>
+              <w:bottom w:type="dxa" w:w="60"/>
+              <w:right w:type="dxa" w:w="100"/>
+            </w:tcMar>
+          </w:tcPr>
+          <w:p>
+            <w:r>
+              <w:rPr>
+                <w:rFonts w:ascii="Arial" w:cs="Arial" w:eastAsia="Arial" w:hAnsi="Arial"/>
+                <w:sz w:val="20"/>
+                <w:szCs w:val="20"/>
+              </w:rPr>
+              <w:t xml:space="preserve">逻辑</w:t>
+            </w:r>
+          </w:p>
+        </w:tc>
+        <w:tc>
+          <w:tcPr>
+            <w:tcW w:type="dxa" w:w="4026"/>
+            <w:tcBorders>
+              <w:top w:val="single" w:color="CCCCCC" w:sz="1"/>
+              <w:left w:val="single" w:color="CCCCCC" w:sz="1"/>
+              <w:bottom w:val="single" w:color="CCCCCC" w:sz="1"/>
+              <w:right w:val="single" w:color="CCCCCC" w:sz="1"/>
+            </w:tcBorders>
+            <w:tcMar>
+              <w:top w:type="dxa" w:w="60"/>
+              <w:left w:type="dxa" w:w="100"/>
+              <w:bottom w:type="dxa" w:w="60"/>
+              <w:right w:type="dxa" w:w="100"/>
+            </w:tcMar>
+          </w:tcPr>
+          <w:p>
+            <w:r>
+              <w:rPr>
+                <w:rFonts w:ascii="Arial" w:cs="Arial" w:eastAsia="Arial" w:hAnsi="Arial"/>
+                <w:sz w:val="20"/>
+                <w:szCs w:val="20"/>
+              </w:rPr>
+              <w:t xml:space="preserve">requirePermission + buildScopeWhere</w:t>
+            </w:r>
+          </w:p>
+        </w:tc>
+      </w:tr>
+      <w:tr>
+        <w:tc>
+          <w:tcPr>
+            <w:tcW w:type="dxa" w:w="3500"/>
+            <w:tcBorders>
+              <w:top w:val="single" w:color="CCCCCC" w:sz="1"/>
+              <w:left w:val="single" w:color="CCCCCC" w:sz="1"/>
+              <w:bottom w:val="single" w:color="CCCCCC" w:sz="1"/>
+              <w:right w:val="single" w:color="CCCCCC" w:sz="1"/>
+            </w:tcBorders>
+            <w:tcMar>
+              <w:top w:type="dxa" w:w="60"/>
+              <w:left w:type="dxa" w:w="100"/>
+              <w:bottom w:type="dxa" w:w="60"/>
+              <w:right w:type="dxa" w:w="100"/>
+            </w:tcMar>
+          </w:tcPr>
+          <w:p>
+            <w:r>
+              <w:rPr>
+                <w:rFonts w:ascii="Arial" w:cs="Arial" w:eastAsia="Arial" w:hAnsi="Arial"/>
+                <w:sz w:val="20"/>
+                <w:szCs w:val="20"/>
+              </w:rPr>
+              <w:t xml:space="preserve">server/auth/session.ts</w:t>
+            </w:r>
+          </w:p>
+        </w:tc>
+        <w:tc>
+          <w:tcPr>
+            <w:tcW w:type="dxa" w:w="1500"/>
+            <w:tcBorders>
+              <w:top w:val="single" w:color="CCCCCC" w:sz="1"/>
+              <w:left w:val="single" w:color="CCCCCC" w:sz="1"/>
+              <w:bottom w:val="single" w:color="CCCCCC" w:sz="1"/>
+              <w:right w:val="single" w:color="CCCCCC" w:sz="1"/>
+            </w:tcBorders>
+            <w:tcMar>
+              <w:top w:type="dxa" w:w="60"/>
+              <w:left w:type="dxa" w:w="100"/>
+              <w:bottom w:type="dxa" w:w="60"/>
+              <w:right w:type="dxa" w:w="100"/>
+            </w:tcMar>
+          </w:tcPr>
+          <w:p>
+            <w:r>
+              <w:rPr>
+                <w:rFonts w:ascii="Arial" w:cs="Arial" w:eastAsia="Arial" w:hAnsi="Arial"/>
+                <w:sz w:val="20"/>
+                <w:szCs w:val="20"/>
+              </w:rPr>
+              <w:t xml:space="preserve">逻辑</w:t>
+            </w:r>
+          </w:p>
+        </w:tc>
+        <w:tc>
+          <w:tcPr>
+            <w:tcW w:type="dxa" w:w="4026"/>
+            <w:tcBorders>
+              <w:top w:val="single" w:color="CCCCCC" w:sz="1"/>
+              <w:left w:val="single" w:color="CCCCCC" w:sz="1"/>
+              <w:bottom w:val="single" w:color="CCCCCC" w:sz="1"/>
+              <w:right w:val="single" w:color="CCCCCC" w:sz="1"/>
+            </w:tcBorders>
+            <w:tcMar>
+              <w:top w:type="dxa" w:w="60"/>
+              <w:left w:type="dxa" w:w="100"/>
+              <w:bottom w:type="dxa" w:w="60"/>
+              <w:right w:type="dxa" w:w="100"/>
+            </w:tcMar>
+          </w:tcPr>
+          <w:p>
+            <w:r>
+              <w:rPr>
+                <w:rFonts w:ascii="Arial" w:cs="Arial" w:eastAsia="Arial" w:hAnsi="Arial"/>
+                <w:sz w:val="20"/>
+                <w:szCs w:val="20"/>
+              </w:rPr>
+              <w:t xml:space="preserve">Cookie 开发态会话管理</w:t>
+            </w:r>
+          </w:p>
+        </w:tc>
+      </w:tr>
+      <w:tr>
+        <w:tc>
+          <w:tcPr>
+            <w:tcW w:type="dxa" w:w="3500"/>
+            <w:tcBorders>
+              <w:top w:val="single" w:color="CCCCCC" w:sz="1"/>
+              <w:left w:val="single" w:color="CCCCCC" w:sz="1"/>
+              <w:bottom w:val="single" w:color="CCCCCC" w:sz="1"/>
+              <w:right w:val="single" w:color="CCCCCC" w:sz="1"/>
+            </w:tcBorders>
+            <w:tcMar>
+              <w:top w:type="dxa" w:w="60"/>
+              <w:left w:type="dxa" w:w="100"/>
+              <w:bottom w:type="dxa" w:w="60"/>
+              <w:right w:type="dxa" w:w="100"/>
+            </w:tcMar>
+          </w:tcPr>
+          <w:p>
+            <w:r>
+              <w:rPr>
+                <w:rFonts w:ascii="Arial" w:cs="Arial" w:eastAsia="Arial" w:hAnsi="Arial"/>
+                <w:sz w:val="20"/>
+                <w:szCs w:val="20"/>
+              </w:rPr>
+              <w:t xml:space="preserve">components/auth/RoleSwitcher.tsx</w:t>
+            </w:r>
+          </w:p>
+        </w:tc>
+        <w:tc>
+          <w:tcPr>
+            <w:tcW w:type="dxa" w:w="1500"/>
+            <w:tcBorders>
+              <w:top w:val="single" w:color="CCCCCC" w:sz="1"/>
+              <w:left w:val="single" w:color="CCCCCC" w:sz="1"/>
+              <w:bottom w:val="single" w:color="CCCCCC" w:sz="1"/>
+              <w:right w:val="single" w:color="CCCCCC" w:sz="1"/>
+            </w:tcBorders>
+            <w:tcMar>
+              <w:top w:type="dxa" w:w="60"/>
+              <w:left w:type="dxa" w:w="100"/>
+              <w:bottom w:type="dxa" w:w="60"/>
+              <w:right w:type="dxa" w:w="100"/>
+            </w:tcMar>
+          </w:tcPr>
+          <w:p>
+            <w:r>
+              <w:rPr>
+                <w:rFonts w:ascii="Arial" w:cs="Arial" w:eastAsia="Arial" w:hAnsi="Arial"/>
+                <w:sz w:val="20"/>
+                <w:szCs w:val="20"/>
+              </w:rPr>
+              <w:t xml:space="preserve">组件</w:t>
+            </w:r>
+          </w:p>
+        </w:tc>
+        <w:tc>
+          <w:tcPr>
+            <w:tcW w:type="dxa" w:w="4026"/>
+            <w:tcBorders>
+              <w:top w:val="single" w:color="CCCCCC" w:sz="1"/>
+              <w:left w:val="single" w:color="CCCCCC" w:sz="1"/>
+              <w:bottom w:val="single" w:color="CCCCCC" w:sz="1"/>
+              <w:right w:val="single" w:color="CCCCCC" w:sz="1"/>
+            </w:tcBorders>
+            <w:tcMar>
+              <w:top w:type="dxa" w:w="60"/>
+              <w:left w:type="dxa" w:w="100"/>
+              <w:bottom w:type="dxa" w:w="60"/>
+              <w:right w:type="dxa" w:w="100"/>
+            </w:tcMar>
+          </w:tcPr>
+          <w:p>
+            <w:r>
+              <w:rPr>
+                <w:rFonts w:ascii="Arial" w:cs="Arial" w:eastAsia="Arial" w:hAnsi="Arial"/>
+                <w:sz w:val="20"/>
+                <w:szCs w:val="20"/>
+              </w:rPr>
+              <w:t xml:space="preserve">角色切换下拉菜单（6 角色）</w:t>
+            </w:r>
+          </w:p>
+        </w:tc>
+      </w:tr>
+      <w:tr>
+        <w:tc>
+          <w:tcPr>
+            <w:tcW w:type="dxa" w:w="3500"/>
+            <w:tcBorders>
+              <w:top w:val="single" w:color="CCCCCC" w:sz="1"/>
+              <w:left w:val="single" w:color="CCCCCC" w:sz="1"/>
+              <w:bottom w:val="single" w:color="CCCCCC" w:sz="1"/>
+              <w:right w:val="single" w:color="CCCCCC" w:sz="1"/>
+            </w:tcBorders>
+            <w:tcMar>
+              <w:top w:type="dxa" w:w="60"/>
+              <w:left w:type="dxa" w:w="100"/>
+              <w:bottom w:type="dxa" w:w="60"/>
+              <w:right w:type="dxa" w:w="100"/>
+            </w:tcMar>
+          </w:tcPr>
+          <w:p>
+            <w:r>
+              <w:rPr>
+                <w:rFonts w:ascii="Arial" w:cs="Arial" w:eastAsia="Arial" w:hAnsi="Arial"/>
+                <w:sz w:val="20"/>
+                <w:szCs w:val="20"/>
+              </w:rPr>
+              <w:t xml:space="preserve">components/auth/PermissionGate.tsx</w:t>
+            </w:r>
+          </w:p>
+        </w:tc>
+        <w:tc>
+          <w:tcPr>
+            <w:tcW w:type="dxa" w:w="1500"/>
+            <w:tcBorders>
+              <w:top w:val="single" w:color="CCCCCC" w:sz="1"/>
+              <w:left w:val="single" w:color="CCCCCC" w:sz="1"/>
+              <w:bottom w:val="single" w:color="CCCCCC" w:sz="1"/>
+              <w:right w:val="single" w:color="CCCCCC" w:sz="1"/>
+            </w:tcBorders>
+            <w:tcMar>
+              <w:top w:type="dxa" w:w="60"/>
+              <w:left w:type="dxa" w:w="100"/>
+              <w:bottom w:type="dxa" w:w="60"/>
+              <w:right w:type="dxa" w:w="100"/>
+            </w:tcMar>
+          </w:tcPr>
+          <w:p>
+            <w:r>
+              <w:rPr>
+                <w:rFonts w:ascii="Arial" w:cs="Arial" w:eastAsia="Arial" w:hAnsi="Arial"/>
+                <w:sz w:val="20"/>
+                <w:szCs w:val="20"/>
+              </w:rPr>
+              <w:t xml:space="preserve">组件</w:t>
+            </w:r>
+          </w:p>
+        </w:tc>
+        <w:tc>
+          <w:tcPr>
+            <w:tcW w:type="dxa" w:w="4026"/>
+            <w:tcBorders>
+              <w:top w:val="single" w:color="CCCCCC" w:sz="1"/>
+              <w:left w:val="single" w:color="CCCCCC" w:sz="1"/>
+              <w:bottom w:val="single" w:color="CCCCCC" w:sz="1"/>
+              <w:right w:val="single" w:color="CCCCCC" w:sz="1"/>
+            </w:tcBorders>
+            <w:tcMar>
+              <w:top w:type="dxa" w:w="60"/>
+              <w:left w:type="dxa" w:w="100"/>
+              <w:bottom w:type="dxa" w:w="60"/>
+              <w:right w:type="dxa" w:w="100"/>
+            </w:tcMar>
+          </w:tcPr>
+          <w:p>
+            <w:r>
+              <w:rPr>
+                <w:rFonts w:ascii="Arial" w:cs="Arial" w:eastAsia="Arial" w:hAnsi="Arial"/>
+                <w:sz w:val="20"/>
+                <w:szCs w:val="20"/>
+              </w:rPr>
+              <w:t xml:space="preserve">客户端权限门控</w:t>
+            </w:r>
+          </w:p>
+        </w:tc>
+      </w:tr>
+      <w:tr>
+        <w:tc>
+          <w:tcPr>
+            <w:tcW w:type="dxa" w:w="3500"/>
+            <w:tcBorders>
+              <w:top w:val="single" w:color="CCCCCC" w:sz="1"/>
+              <w:left w:val="single" w:color="CCCCCC" w:sz="1"/>
+              <w:bottom w:val="single" w:color="CCCCCC" w:sz="1"/>
+              <w:right w:val="single" w:color="CCCCCC" w:sz="1"/>
+            </w:tcBorders>
+            <w:tcMar>
+              <w:top w:type="dxa" w:w="60"/>
+              <w:left w:type="dxa" w:w="100"/>
+              <w:bottom w:type="dxa" w:w="60"/>
+              <w:right w:type="dxa" w:w="100"/>
+            </w:tcMar>
+          </w:tcPr>
+          <w:p>
+            <w:r>
+              <w:rPr>
+                <w:rFonts w:ascii="Arial" w:cs="Arial" w:eastAsia="Arial" w:hAnsi="Arial"/>
+                <w:sz w:val="20"/>
+                <w:szCs w:val="20"/>
+              </w:rPr>
+              <w:t xml:space="preserve">app/api/auth/set-role/route.ts</w:t>
+            </w:r>
+          </w:p>
+        </w:tc>
+        <w:tc>
+          <w:tcPr>
+            <w:tcW w:type="dxa" w:w="1500"/>
+            <w:tcBorders>
+              <w:top w:val="single" w:color="CCCCCC" w:sz="1"/>
+              <w:left w:val="single" w:color="CCCCCC" w:sz="1"/>
+              <w:bottom w:val="single" w:color="CCCCCC" w:sz="1"/>
+              <w:right w:val="single" w:color="CCCCCC" w:sz="1"/>
+            </w:tcBorders>
+            <w:tcMar>
+              <w:top w:type="dxa" w:w="60"/>
+              <w:left w:type="dxa" w:w="100"/>
+              <w:bottom w:type="dxa" w:w="60"/>
+              <w:right w:type="dxa" w:w="100"/>
+            </w:tcMar>
+          </w:tcPr>
+          <w:p>
+            <w:r>
+              <w:rPr>
+                <w:rFonts w:ascii="Arial" w:cs="Arial" w:eastAsia="Arial" w:hAnsi="Arial"/>
+                <w:sz w:val="20"/>
+                <w:szCs w:val="20"/>
+              </w:rPr>
+              <w:t xml:space="preserve">API</w:t>
+            </w:r>
+          </w:p>
+        </w:tc>
+        <w:tc>
+          <w:tcPr>
+            <w:tcW w:type="dxa" w:w="4026"/>
+            <w:tcBorders>
+              <w:top w:val="single" w:color="CCCCCC" w:sz="1"/>
+              <w:left w:val="single" w:color="CCCCCC" w:sz="1"/>
+              <w:bottom w:val="single" w:color="CCCCCC" w:sz="1"/>
+              <w:right w:val="single" w:color="CCCCCC" w:sz="1"/>
+            </w:tcBorders>
+            <w:tcMar>
+              <w:top w:type="dxa" w:w="60"/>
+              <w:left w:type="dxa" w:w="100"/>
+              <w:bottom w:type="dxa" w:w="60"/>
+              <w:right w:type="dxa" w:w="100"/>
+            </w:tcMar>
+          </w:tcPr>
+          <w:p>
+            <w:r>
+              <w:rPr>
+                <w:rFonts w:ascii="Arial" w:cs="Arial" w:eastAsia="Arial" w:hAnsi="Arial"/>
+                <w:sz w:val="20"/>
+                <w:szCs w:val="20"/>
+              </w:rPr>
+              <w:t xml:space="preserve">POST 设置当前角色（cookie）</w:t>
+            </w:r>
+          </w:p>
+        </w:tc>
+      </w:tr>
+      <w:tr>
+        <w:tc>
+          <w:tcPr>
+            <w:tcW w:type="dxa" w:w="3500"/>
+            <w:tcBorders>
+              <w:top w:val="single" w:color="CCCCCC" w:sz="1"/>
+              <w:left w:val="single" w:color="CCCCCC" w:sz="1"/>
+              <w:bottom w:val="single" w:color="CCCCCC" w:sz="1"/>
+              <w:right w:val="single" w:color="CCCCCC" w:sz="1"/>
+            </w:tcBorders>
+            <w:tcMar>
+              <w:top w:type="dxa" w:w="60"/>
+              <w:left w:type="dxa" w:w="100"/>
+              <w:bottom w:type="dxa" w:w="60"/>
+              <w:right w:type="dxa" w:w="100"/>
+            </w:tcMar>
+          </w:tcPr>
+          <w:p>
+            <w:r>
+              <w:rPr>
+                <w:rFonts w:ascii="Arial" w:cs="Arial" w:eastAsia="Arial" w:hAnsi="Arial"/>
+                <w:sz w:val="20"/>
+                <w:szCs w:val="20"/>
+              </w:rPr>
+              <w:t xml:space="preserve">app/api/auth/context/route.ts</w:t>
+            </w:r>
+          </w:p>
+        </w:tc>
+        <w:tc>
+          <w:tcPr>
+            <w:tcW w:type="dxa" w:w="1500"/>
+            <w:tcBorders>
+              <w:top w:val="single" w:color="CCCCCC" w:sz="1"/>
+              <w:left w:val="single" w:color="CCCCCC" w:sz="1"/>
+              <w:bottom w:val="single" w:color="CCCCCC" w:sz="1"/>
+              <w:right w:val="single" w:color="CCCCCC" w:sz="1"/>
+            </w:tcBorders>
+            <w:tcMar>
+              <w:top w:type="dxa" w:w="60"/>
+              <w:left w:type="dxa" w:w="100"/>
+              <w:bottom w:type="dxa" w:w="60"/>
+              <w:right w:type="dxa" w:w="100"/>
+            </w:tcMar>
+          </w:tcPr>
+          <w:p>
+            <w:r>
+              <w:rPr>
+                <w:rFonts w:ascii="Arial" w:cs="Arial" w:eastAsia="Arial" w:hAnsi="Arial"/>
+                <w:sz w:val="20"/>
+                <w:szCs w:val="20"/>
+              </w:rPr>
+              <w:t xml:space="preserve">API</w:t>
+            </w:r>
+          </w:p>
+        </w:tc>
+        <w:tc>
+          <w:tcPr>
+            <w:tcW w:type="dxa" w:w="4026"/>
+            <w:tcBorders>
+              <w:top w:val="single" w:color="CCCCCC" w:sz="1"/>
+              <w:left w:val="single" w:color="CCCCCC" w:sz="1"/>
+              <w:bottom w:val="single" w:color="CCCCCC" w:sz="1"/>
+              <w:right w:val="single" w:color="CCCCCC" w:sz="1"/>
+            </w:tcBorders>
+            <w:tcMar>
+              <w:top w:type="dxa" w:w="60"/>
+              <w:left w:type="dxa" w:w="100"/>
+              <w:bottom w:type="dxa" w:w="60"/>
+              <w:right w:type="dxa" w:w="100"/>
+            </w:tcMar>
+          </w:tcPr>
+          <w:p>
+            <w:r>
+              <w:rPr>
+                <w:rFonts w:ascii="Arial" w:cs="Arial" w:eastAsia="Arial" w:hAnsi="Arial"/>
+                <w:sz w:val="20"/>
+                <w:szCs w:val="20"/>
+              </w:rPr>
+              <w:t xml:space="preserve">GET 获取当前会话上下文</w:t>
+            </w:r>
+          </w:p>
+        </w:tc>
+      </w:tr>
+      <w:tr>
+        <w:tc>
+          <w:tcPr>
+            <w:tcW w:type="dxa" w:w="3500"/>
+            <w:tcBorders>
+              <w:top w:val="single" w:color="CCCCCC" w:sz="1"/>
+              <w:left w:val="single" w:color="CCCCCC" w:sz="1"/>
+              <w:bottom w:val="single" w:color="CCCCCC" w:sz="1"/>
+              <w:right w:val="single" w:color="CCCCCC" w:sz="1"/>
+            </w:tcBorders>
+            <w:tcMar>
+              <w:top w:type="dxa" w:w="60"/>
+              <w:left w:type="dxa" w:w="100"/>
+              <w:bottom w:type="dxa" w:w="60"/>
+              <w:right w:type="dxa" w:w="100"/>
+            </w:tcMar>
+          </w:tcPr>
+          <w:p>
+            <w:r>
+              <w:rPr>
+                <w:rFonts w:ascii="Arial" w:cs="Arial" w:eastAsia="Arial" w:hAnsi="Arial"/>
+                <w:sz w:val="20"/>
+                <w:szCs w:val="20"/>
+              </w:rPr>
+              <w:t xml:space="preserve">app/api/permissions/route.ts</w:t>
+            </w:r>
+          </w:p>
+        </w:tc>
+        <w:tc>
+          <w:tcPr>
+            <w:tcW w:type="dxa" w:w="1500"/>
+            <w:tcBorders>
+              <w:top w:val="single" w:color="CCCCCC" w:sz="1"/>
+              <w:left w:val="single" w:color="CCCCCC" w:sz="1"/>
+              <w:bottom w:val="single" w:color="CCCCCC" w:sz="1"/>
+              <w:right w:val="single" w:color="CCCCCC" w:sz="1"/>
+            </w:tcBorders>
+            <w:tcMar>
+              <w:top w:type="dxa" w:w="60"/>
+              <w:left w:type="dxa" w:w="100"/>
+              <w:bottom w:type="dxa" w:w="60"/>
+              <w:right w:type="dxa" w:w="100"/>
+            </w:tcMar>
+          </w:tcPr>
+          <w:p>
+            <w:r>
+              <w:rPr>
+                <w:rFonts w:ascii="Arial" w:cs="Arial" w:eastAsia="Arial" w:hAnsi="Arial"/>
+                <w:sz w:val="20"/>
+                <w:szCs w:val="20"/>
+              </w:rPr>
+              <w:t xml:space="preserve">API</w:t>
+            </w:r>
+          </w:p>
+        </w:tc>
+        <w:tc>
+          <w:tcPr>
+            <w:tcW w:type="dxa" w:w="4026"/>
+            <w:tcBorders>
+              <w:top w:val="single" w:color="CCCCCC" w:sz="1"/>
+              <w:left w:val="single" w:color="CCCCCC" w:sz="1"/>
+              <w:bottom w:val="single" w:color="CCCCCC" w:sz="1"/>
+              <w:right w:val="single" w:color="CCCCCC" w:sz="1"/>
+            </w:tcBorders>
+            <w:tcMar>
+              <w:top w:type="dxa" w:w="60"/>
+              <w:left w:type="dxa" w:w="100"/>
+              <w:bottom w:type="dxa" w:w="60"/>
+              <w:right w:type="dxa" w:w="100"/>
+            </w:tcMar>
+          </w:tcPr>
+          <w:p>
+            <w:r>
+              <w:rPr>
+                <w:rFonts w:ascii="Arial" w:cs="Arial" w:eastAsia="Arial" w:hAnsi="Arial"/>
+                <w:sz w:val="20"/>
+                <w:szCs w:val="20"/>
+              </w:rPr>
+              <w:t xml:space="preserve">GET 当前角色权限矩阵 JSON</w:t>
+            </w:r>
+          </w:p>
+        </w:tc>
+      </w:tr>
+      <w:tr>
+        <w:tc>
+          <w:tcPr>
+            <w:tcW w:type="dxa" w:w="3500"/>
+            <w:tcBorders>
+              <w:top w:val="single" w:color="CCCCCC" w:sz="1"/>
+              <w:left w:val="single" w:color="CCCCCC" w:sz="1"/>
+              <w:bottom w:val="single" w:color="CCCCCC" w:sz="1"/>
+              <w:right w:val="single" w:color="CCCCCC" w:sz="1"/>
+            </w:tcBorders>
+            <w:tcMar>
+              <w:top w:type="dxa" w:w="60"/>
+              <w:left w:type="dxa" w:w="100"/>
+              <w:bottom w:type="dxa" w:w="60"/>
+              <w:right w:type="dxa" w:w="100"/>
+            </w:tcMar>
+          </w:tcPr>
+          <w:p>
+            <w:r>
+              <w:rPr>
+                <w:rFonts w:ascii="Arial" w:cs="Arial" w:eastAsia="Arial" w:hAnsi="Arial"/>
+                <w:sz w:val="20"/>
+                <w:szCs w:val="20"/>
+              </w:rPr>
+              <w:t xml:space="preserve">app/permissions-debug/page.tsx</w:t>
+            </w:r>
+          </w:p>
+        </w:tc>
+        <w:tc>
+          <w:tcPr>
+            <w:tcW w:type="dxa" w:w="1500"/>
+            <w:tcBorders>
+              <w:top w:val="single" w:color="CCCCCC" w:sz="1"/>
+              <w:left w:val="single" w:color="CCCCCC" w:sz="1"/>
+              <w:bottom w:val="single" w:color="CCCCCC" w:sz="1"/>
+              <w:right w:val="single" w:color="CCCCCC" w:sz="1"/>
+            </w:tcBorders>
+            <w:tcMar>
+              <w:top w:type="dxa" w:w="60"/>
+              <w:left w:type="dxa" w:w="100"/>
+              <w:bottom w:type="dxa" w:w="60"/>
+              <w:right w:type="dxa" w:w="100"/>
+            </w:tcMar>
+          </w:tcPr>
+          <w:p>
+            <w:r>
+              <w:rPr>
+                <w:rFonts w:ascii="Arial" w:cs="Arial" w:eastAsia="Arial" w:hAnsi="Arial"/>
+                <w:sz w:val="20"/>
+                <w:szCs w:val="20"/>
+              </w:rPr>
+              <w:t xml:space="preserve">页面</w:t>
+            </w:r>
+          </w:p>
+        </w:tc>
+        <w:tc>
+          <w:tcPr>
+            <w:tcW w:type="dxa" w:w="4026"/>
+            <w:tcBorders>
+              <w:top w:val="single" w:color="CCCCCC" w:sz="1"/>
+              <w:left w:val="single" w:color="CCCCCC" w:sz="1"/>
+              <w:bottom w:val="single" w:color="CCCCCC" w:sz="1"/>
+              <w:right w:val="single" w:color="CCCCCC" w:sz="1"/>
+            </w:tcBorders>
+            <w:tcMar>
+              <w:top w:type="dxa" w:w="60"/>
+              <w:left w:type="dxa" w:w="100"/>
+              <w:bottom w:type="dxa" w:w="60"/>
+              <w:right w:type="dxa" w:w="100"/>
+            </w:tcMar>
+          </w:tcPr>
+          <w:p>
+            <w:r>
+              <w:rPr>
+                <w:rFonts w:ascii="Arial" w:cs="Arial" w:eastAsia="Arial" w:hAnsi="Arial"/>
+                <w:sz w:val="20"/>
+                <w:szCs w:val="20"/>
+              </w:rPr>
+              <w:t xml:space="preserve">权限调试面板（表格展示）</w:t>
+            </w:r>
+          </w:p>
+        </w:tc>
+      </w:tr>
+      <w:tr>
+        <w:tc>
+          <w:tcPr>
+            <w:tcW w:type="dxa" w:w="3500"/>
+            <w:tcBorders>
+              <w:top w:val="single" w:color="CCCCCC" w:sz="1"/>
+              <w:left w:val="single" w:color="CCCCCC" w:sz="1"/>
+              <w:bottom w:val="single" w:color="CCCCCC" w:sz="1"/>
+              <w:right w:val="single" w:color="CCCCCC" w:sz="1"/>
+            </w:tcBorders>
+            <w:tcMar>
+              <w:top w:type="dxa" w:w="60"/>
+              <w:left w:type="dxa" w:w="100"/>
+              <w:bottom w:type="dxa" w:w="60"/>
+              <w:right w:type="dxa" w:w="100"/>
+            </w:tcMar>
+          </w:tcPr>
+          <w:p>
+            <w:r>
+              <w:rPr>
+                <w:rFonts w:ascii="Arial" w:cs="Arial" w:eastAsia="Arial" w:hAnsi="Arial"/>
+                <w:sz w:val="20"/>
+                <w:szCs w:val="20"/>
+              </w:rPr>
+              <w:t xml:space="preserve">docs/domain/LIRAN_RECRUITING_MODEL.md</w:t>
+            </w:r>
+          </w:p>
+        </w:tc>
+        <w:tc>
+          <w:tcPr>
+            <w:tcW w:type="dxa" w:w="1500"/>
+            <w:tcBorders>
+              <w:top w:val="single" w:color="CCCCCC" w:sz="1"/>
+              <w:left w:val="single" w:color="CCCCCC" w:sz="1"/>
+              <w:bottom w:val="single" w:color="CCCCCC" w:sz="1"/>
+              <w:right w:val="single" w:color="CCCCCC" w:sz="1"/>
+            </w:tcBorders>
+            <w:tcMar>
+              <w:top w:type="dxa" w:w="60"/>
+              <w:left w:type="dxa" w:w="100"/>
+              <w:bottom w:type="dxa" w:w="60"/>
+              <w:right w:type="dxa" w:w="100"/>
+            </w:tcMar>
+          </w:tcPr>
+          <w:p>
+            <w:r>
+              <w:rPr>
+                <w:rFonts w:ascii="Arial" w:cs="Arial" w:eastAsia="Arial" w:hAnsi="Arial"/>
+                <w:sz w:val="20"/>
+                <w:szCs w:val="20"/>
+              </w:rPr>
+              <w:t xml:space="preserve">文档</w:t>
+            </w:r>
+          </w:p>
+        </w:tc>
+        <w:tc>
+          <w:tcPr>
+            <w:tcW w:type="dxa" w:w="4026"/>
+            <w:tcBorders>
+              <w:top w:val="single" w:color="CCCCCC" w:sz="1"/>
+              <w:left w:val="single" w:color="CCCCCC" w:sz="1"/>
+              <w:bottom w:val="single" w:color="CCCCCC" w:sz="1"/>
+              <w:right w:val="single" w:color="CCCCCC" w:sz="1"/>
+            </w:tcBorders>
+            <w:tcMar>
+              <w:top w:type="dxa" w:w="60"/>
+              <w:left w:type="dxa" w:w="100"/>
+              <w:bottom w:type="dxa" w:w="60"/>
+              <w:right w:type="dxa" w:w="100"/>
+            </w:tcMar>
+          </w:tcPr>
+          <w:p>
+            <w:r>
+              <w:rPr>
+                <w:rFonts w:ascii="Arial" w:cs="Arial" w:eastAsia="Arial" w:hAnsi="Arial"/>
+                <w:sz w:val="20"/>
+                <w:szCs w:val="20"/>
+              </w:rPr>
+              <w:t xml:space="preserve">理然招聘模型（骨架）</w:t>
+            </w:r>
+          </w:p>
+        </w:tc>
+      </w:tr>
+      <w:tr>
+        <w:tc>
+          <w:tcPr>
+            <w:tcW w:type="dxa" w:w="3500"/>
+            <w:tcBorders>
+              <w:top w:val="single" w:color="CCCCCC" w:sz="1"/>
+              <w:left w:val="single" w:color="CCCCCC" w:sz="1"/>
+              <w:bottom w:val="single" w:color="CCCCCC" w:sz="1"/>
+              <w:right w:val="single" w:color="CCCCCC" w:sz="1"/>
+            </w:tcBorders>
+            <w:tcMar>
+              <w:top w:type="dxa" w:w="60"/>
+              <w:left w:type="dxa" w:w="100"/>
+              <w:bottom w:type="dxa" w:w="60"/>
+              <w:right w:type="dxa" w:w="100"/>
+            </w:tcMar>
+          </w:tcPr>
+          <w:p>
+            <w:r>
+              <w:rPr>
+                <w:rFonts w:ascii="Arial" w:cs="Arial" w:eastAsia="Arial" w:hAnsi="Arial"/>
+                <w:sz w:val="20"/>
+                <w:szCs w:val="20"/>
+              </w:rPr>
+              <w:t xml:space="preserve">docs/domain/LIRAN_JOB_PROFILE_RULES.md</w:t>
+            </w:r>
+          </w:p>
+        </w:tc>
+        <w:tc>
+          <w:tcPr>
+            <w:tcW w:type="dxa" w:w="1500"/>
+            <w:tcBorders>
+              <w:top w:val="single" w:color="CCCCCC" w:sz="1"/>
+              <w:left w:val="single" w:color="CCCCCC" w:sz="1"/>
+              <w:bottom w:val="single" w:color="CCCCCC" w:sz="1"/>
+              <w:right w:val="single" w:color="CCCCCC" w:sz="1"/>
+            </w:tcBorders>
+            <w:tcMar>
+              <w:top w:type="dxa" w:w="60"/>
+              <w:left w:type="dxa" w:w="100"/>
+              <w:bottom w:type="dxa" w:w="60"/>
+              <w:right w:type="dxa" w:w="100"/>
+            </w:tcMar>
+          </w:tcPr>
+          <w:p>
+            <w:r>
+              <w:rPr>
+                <w:rFonts w:ascii="Arial" w:cs="Arial" w:eastAsia="Arial" w:hAnsi="Arial"/>
+                <w:sz w:val="20"/>
+                <w:szCs w:val="20"/>
+              </w:rPr>
+              <w:t xml:space="preserve">文档</w:t>
+            </w:r>
+          </w:p>
+        </w:tc>
+        <w:tc>
+          <w:tcPr>
+            <w:tcW w:type="dxa" w:w="4026"/>
+            <w:tcBorders>
+              <w:top w:val="single" w:color="CCCCCC" w:sz="1"/>
+              <w:left w:val="single" w:color="CCCCCC" w:sz="1"/>
+              <w:bottom w:val="single" w:color="CCCCCC" w:sz="1"/>
+              <w:right w:val="single" w:color="CCCCCC" w:sz="1"/>
+            </w:tcBorders>
+            <w:tcMar>
+              <w:top w:type="dxa" w:w="60"/>
+              <w:left w:type="dxa" w:w="100"/>
+              <w:bottom w:type="dxa" w:w="60"/>
+              <w:right w:type="dxa" w:w="100"/>
+            </w:tcMar>
+          </w:tcPr>
+          <w:p>
+            <w:r>
+              <w:rPr>
+                <w:rFonts w:ascii="Arial" w:cs="Arial" w:eastAsia="Arial" w:hAnsi="Arial"/>
+                <w:sz w:val="20"/>
+                <w:szCs w:val="20"/>
+              </w:rPr>
+              <w:t xml:space="preserve">岗位画像规则（骨架）</w:t>
+            </w:r>
+          </w:p>
+        </w:tc>
+      </w:tr>
+      <w:tr>
+        <w:tc>
+          <w:tcPr>
+            <w:tcW w:type="dxa" w:w="3500"/>
+            <w:tcBorders>
+              <w:top w:val="single" w:color="CCCCCC" w:sz="1"/>
+              <w:left w:val="single" w:color="CCCCCC" w:sz="1"/>
+              <w:bottom w:val="single" w:color="CCCCCC" w:sz="1"/>
+              <w:right w:val="single" w:color="CCCCCC" w:sz="1"/>
+            </w:tcBorders>
+            <w:tcMar>
+              <w:top w:type="dxa" w:w="60"/>
+              <w:left w:type="dxa" w:w="100"/>
+              <w:bottom w:type="dxa" w:w="60"/>
+              <w:right w:type="dxa" w:w="100"/>
+            </w:tcMar>
+          </w:tcPr>
+          <w:p>
+            <w:r>
+              <w:rPr>
+                <w:rFonts w:ascii="Arial" w:cs="Arial" w:eastAsia="Arial" w:hAnsi="Arial"/>
+                <w:sz w:val="20"/>
+                <w:szCs w:val="20"/>
+              </w:rPr>
+              <w:t xml:space="preserve">docs/domain/LIRAN_INTERVIEW_SCORECARD.md</w:t>
+            </w:r>
+          </w:p>
+        </w:tc>
+        <w:tc>
+          <w:tcPr>
+            <w:tcW w:type="dxa" w:w="1500"/>
+            <w:tcBorders>
+              <w:top w:val="single" w:color="CCCCCC" w:sz="1"/>
+              <w:left w:val="single" w:color="CCCCCC" w:sz="1"/>
+              <w:bottom w:val="single" w:color="CCCCCC" w:sz="1"/>
+              <w:right w:val="single" w:color="CCCCCC" w:sz="1"/>
+            </w:tcBorders>
+            <w:tcMar>
+              <w:top w:type="dxa" w:w="60"/>
+              <w:left w:type="dxa" w:w="100"/>
+              <w:bottom w:type="dxa" w:w="60"/>
+              <w:right w:type="dxa" w:w="100"/>
+            </w:tcMar>
+          </w:tcPr>
+          <w:p>
+            <w:r>
+              <w:rPr>
+                <w:rFonts w:ascii="Arial" w:cs="Arial" w:eastAsia="Arial" w:hAnsi="Arial"/>
+                <w:sz w:val="20"/>
+                <w:szCs w:val="20"/>
+              </w:rPr>
+              <w:t xml:space="preserve">文档</w:t>
+            </w:r>
+          </w:p>
+        </w:tc>
+        <w:tc>
+          <w:tcPr>
+            <w:tcW w:type="dxa" w:w="4026"/>
+            <w:tcBorders>
+              <w:top w:val="single" w:color="CCCCCC" w:sz="1"/>
+              <w:left w:val="single" w:color="CCCCCC" w:sz="1"/>
+              <w:bottom w:val="single" w:color="CCCCCC" w:sz="1"/>
+              <w:right w:val="single" w:color="CCCCCC" w:sz="1"/>
+            </w:tcBorders>
+            <w:tcMar>
+              <w:top w:type="dxa" w:w="60"/>
+              <w:left w:type="dxa" w:w="100"/>
+              <w:bottom w:type="dxa" w:w="60"/>
+              <w:right w:type="dxa" w:w="100"/>
+            </w:tcMar>
+          </w:tcPr>
+          <w:p>
+            <w:r>
+              <w:rPr>
+                <w:rFonts w:ascii="Arial" w:cs="Arial" w:eastAsia="Arial" w:hAnsi="Arial"/>
+                <w:sz w:val="20"/>
+                <w:szCs w:val="20"/>
+              </w:rPr>
+              <w:t xml:space="preserve">面试评分卡（骨架）</w:t>
+            </w:r>
+          </w:p>
+        </w:tc>
+      </w:tr>
+      <w:tr>
+        <w:tc>
+          <w:tcPr>
+            <w:tcW w:type="dxa" w:w="3500"/>
+            <w:tcBorders>
+              <w:top w:val="single" w:color="CCCCCC" w:sz="1"/>
+              <w:left w:val="single" w:color="CCCCCC" w:sz="1"/>
+              <w:bottom w:val="single" w:color="CCCCCC" w:sz="1"/>
+              <w:right w:val="single" w:color="CCCCCC" w:sz="1"/>
+            </w:tcBorders>
+            <w:tcMar>
+              <w:top w:type="dxa" w:w="60"/>
+              <w:left w:type="dxa" w:w="100"/>
+              <w:bottom w:type="dxa" w:w="60"/>
+              <w:right w:type="dxa" w:w="100"/>
+            </w:tcMar>
+          </w:tcPr>
+          <w:p>
+            <w:r>
+              <w:rPr>
+                <w:rFonts w:ascii="Arial" w:cs="Arial" w:eastAsia="Arial" w:hAnsi="Arial"/>
+                <w:sz w:val="20"/>
+                <w:szCs w:val="20"/>
+              </w:rPr>
+              <w:t xml:space="preserve">docs/domain/LIRAN_OFFER_RISK_RULES.md</w:t>
+            </w:r>
+          </w:p>
+        </w:tc>
+        <w:tc>
+          <w:tcPr>
+            <w:tcW w:type="dxa" w:w="1500"/>
+            <w:tcBorders>
+              <w:top w:val="single" w:color="CCCCCC" w:sz="1"/>
+              <w:left w:val="single" w:color="CCCCCC" w:sz="1"/>
+              <w:bottom w:val="single" w:color="CCCCCC" w:sz="1"/>
+              <w:right w:val="single" w:color="CCCCCC" w:sz="1"/>
+            </w:tcBorders>
+            <w:tcMar>
+              <w:top w:type="dxa" w:w="60"/>
+              <w:left w:type="dxa" w:w="100"/>
+              <w:bottom w:type="dxa" w:w="60"/>
+              <w:right w:type="dxa" w:w="100"/>
+            </w:tcMar>
+          </w:tcPr>
+          <w:p>
+            <w:r>
+              <w:rPr>
+                <w:rFonts w:ascii="Arial" w:cs="Arial" w:eastAsia="Arial" w:hAnsi="Arial"/>
+                <w:sz w:val="20"/>
+                <w:szCs w:val="20"/>
+              </w:rPr>
+              <w:t xml:space="preserve">文档</w:t>
+            </w:r>
+          </w:p>
+        </w:tc>
+        <w:tc>
+          <w:tcPr>
+            <w:tcW w:type="dxa" w:w="4026"/>
+            <w:tcBorders>
+              <w:top w:val="single" w:color="CCCCCC" w:sz="1"/>
+              <w:left w:val="single" w:color="CCCCCC" w:sz="1"/>
+              <w:bottom w:val="single" w:color="CCCCCC" w:sz="1"/>
+              <w:right w:val="single" w:color="CCCCCC" w:sz="1"/>
+            </w:tcBorders>
+            <w:tcMar>
+              <w:top w:type="dxa" w:w="60"/>
+              <w:left w:type="dxa" w:w="100"/>
+              <w:bottom w:type="dxa" w:w="60"/>
+              <w:right w:type="dxa" w:w="100"/>
+            </w:tcMar>
+          </w:tcPr>
+          <w:p>
+            <w:r>
+              <w:rPr>
+                <w:rFonts w:ascii="Arial" w:cs="Arial" w:eastAsia="Arial" w:hAnsi="Arial"/>
+                <w:sz w:val="20"/>
+                <w:szCs w:val="20"/>
+              </w:rPr>
+              <w:t xml:space="preserve">Offer 风险规则（骨架）</w:t>
+            </w:r>
+          </w:p>
+        </w:tc>
+      </w:tr>
+      <w:tr>
+        <w:tc>
+          <w:tcPr>
+            <w:tcW w:type="dxa" w:w="3500"/>
+            <w:tcBorders>
+              <w:top w:val="single" w:color="CCCCCC" w:sz="1"/>
+              <w:left w:val="single" w:color="CCCCCC" w:sz="1"/>
+              <w:bottom w:val="single" w:color="CCCCCC" w:sz="1"/>
+              <w:right w:val="single" w:color="CCCCCC" w:sz="1"/>
+            </w:tcBorders>
+            <w:tcMar>
+              <w:top w:type="dxa" w:w="60"/>
+              <w:left w:type="dxa" w:w="100"/>
+              <w:bottom w:type="dxa" w:w="60"/>
+              <w:right w:type="dxa" w:w="100"/>
+            </w:tcMar>
+          </w:tcPr>
+          <w:p>
+            <w:r>
+              <w:rPr>
+                <w:rFonts w:ascii="Arial" w:cs="Arial" w:eastAsia="Arial" w:hAnsi="Arial"/>
+                <w:sz w:val="20"/>
+                <w:szCs w:val="20"/>
+              </w:rPr>
+              <w:t xml:space="preserve">docs/domain/LIRAN_AI_ANALYSIS_RULES.md</w:t>
+            </w:r>
+          </w:p>
+        </w:tc>
+        <w:tc>
+          <w:tcPr>
+            <w:tcW w:type="dxa" w:w="1500"/>
+            <w:tcBorders>
+              <w:top w:val="single" w:color="CCCCCC" w:sz="1"/>
+              <w:left w:val="single" w:color="CCCCCC" w:sz="1"/>
+              <w:bottom w:val="single" w:color="CCCCCC" w:sz="1"/>
+              <w:right w:val="single" w:color="CCCCCC" w:sz="1"/>
+            </w:tcBorders>
+            <w:tcMar>
+              <w:top w:type="dxa" w:w="60"/>
+              <w:left w:type="dxa" w:w="100"/>
+              <w:bottom w:type="dxa" w:w="60"/>
+              <w:right w:type="dxa" w:w="100"/>
+            </w:tcMar>
+          </w:tcPr>
+          <w:p>
+            <w:r>
+              <w:rPr>
+                <w:rFonts w:ascii="Arial" w:cs="Arial" w:eastAsia="Arial" w:hAnsi="Arial"/>
+                <w:sz w:val="20"/>
+                <w:szCs w:val="20"/>
+              </w:rPr>
+              <w:t xml:space="preserve">文档</w:t>
+            </w:r>
+          </w:p>
+        </w:tc>
+        <w:tc>
+          <w:tcPr>
+            <w:tcW w:type="dxa" w:w="4026"/>
+            <w:tcBorders>
+              <w:top w:val="single" w:color="CCCCCC" w:sz="1"/>
+              <w:left w:val="single" w:color="CCCCCC" w:sz="1"/>
+              <w:bottom w:val="single" w:color="CCCCCC" w:sz="1"/>
+              <w:right w:val="single" w:color="CCCCCC" w:sz="1"/>
+            </w:tcBorders>
+            <w:tcMar>
+              <w:top w:type="dxa" w:w="60"/>
+              <w:left w:type="dxa" w:w="100"/>
+              <w:bottom w:type="dxa" w:w="60"/>
+              <w:right w:type="dxa" w:w="100"/>
+            </w:tcMar>
+          </w:tcPr>
+          <w:p>
+            <w:r>
+              <w:rPr>
+                <w:rFonts w:ascii="Arial" w:cs="Arial" w:eastAsia="Arial" w:hAnsi="Arial"/>
+                <w:sz w:val="20"/>
+                <w:szCs w:val="20"/>
+              </w:rPr>
+              <w:t xml:space="preserve">AI 分析规则（骨架）</w:t>
+            </w:r>
+          </w:p>
+        </w:tc>
+      </w:tr>
+      <w:tr>
+        <w:tc>
+          <w:tcPr>
+            <w:tcW w:type="dxa" w:w="3500"/>
+            <w:tcBorders>
+              <w:top w:val="single" w:color="CCCCCC" w:sz="1"/>
+              <w:left w:val="single" w:color="CCCCCC" w:sz="1"/>
+              <w:bottom w:val="single" w:color="CCCCCC" w:sz="1"/>
+              <w:right w:val="single" w:color="CCCCCC" w:sz="1"/>
+            </w:tcBorders>
+            <w:tcMar>
+              <w:top w:type="dxa" w:w="60"/>
+              <w:left w:type="dxa" w:w="100"/>
+              <w:bottom w:type="dxa" w:w="60"/>
+              <w:right w:type="dxa" w:w="100"/>
+            </w:tcMar>
+          </w:tcPr>
+          <w:p>
+            <w:r>
+              <w:rPr>
+                <w:rFonts w:ascii="Arial" w:cs="Arial" w:eastAsia="Arial" w:hAnsi="Arial"/>
+                <w:sz w:val="20"/>
+                <w:szCs w:val="20"/>
+              </w:rPr>
+              <w:t xml:space="preserve">docs/domain/LIRAN_INTERVIEWER_ENABLEMENT.md</w:t>
+            </w:r>
+          </w:p>
+        </w:tc>
+        <w:tc>
+          <w:tcPr>
+            <w:tcW w:type="dxa" w:w="1500"/>
+            <w:tcBorders>
+              <w:top w:val="single" w:color="CCCCCC" w:sz="1"/>
+              <w:left w:val="single" w:color="CCCCCC" w:sz="1"/>
+              <w:bottom w:val="single" w:color="CCCCCC" w:sz="1"/>
+              <w:right w:val="single" w:color="CCCCCC" w:sz="1"/>
+            </w:tcBorders>
+            <w:tcMar>
+              <w:top w:type="dxa" w:w="60"/>
+              <w:left w:type="dxa" w:w="100"/>
+              <w:bottom w:type="dxa" w:w="60"/>
+              <w:right w:type="dxa" w:w="100"/>
+            </w:tcMar>
+          </w:tcPr>
+          <w:p>
+            <w:r>
+              <w:rPr>
+                <w:rFonts w:ascii="Arial" w:cs="Arial" w:eastAsia="Arial" w:hAnsi="Arial"/>
+                <w:sz w:val="20"/>
+                <w:szCs w:val="20"/>
+              </w:rPr>
+              <w:t xml:space="preserve">文档</w:t>
+            </w:r>
+          </w:p>
+        </w:tc>
+        <w:tc>
+          <w:tcPr>
+            <w:tcW w:type="dxa" w:w="4026"/>
+            <w:tcBorders>
+              <w:top w:val="single" w:color="CCCCCC" w:sz="1"/>
+              <w:left w:val="single" w:color="CCCCCC" w:sz="1"/>
+              <w:bottom w:val="single" w:color="CCCCCC" w:sz="1"/>
+              <w:right w:val="single" w:color="CCCCCC" w:sz="1"/>
+            </w:tcBorders>
+            <w:tcMar>
+              <w:top w:type="dxa" w:w="60"/>
+              <w:left w:type="dxa" w:w="100"/>
+              <w:bottom w:type="dxa" w:w="60"/>
+              <w:right w:type="dxa" w:w="100"/>
+            </w:tcMar>
+          </w:tcPr>
+          <w:p>
+            <w:r>
+              <w:rPr>
+                <w:rFonts w:ascii="Arial" w:cs="Arial" w:eastAsia="Arial" w:hAnsi="Arial"/>
+                <w:sz w:val="20"/>
+                <w:szCs w:val="20"/>
+              </w:rPr>
+              <w:t xml:space="preserve">面试官赋能（骨架）</w:t>
+            </w:r>
+          </w:p>
+        </w:tc>
+      </w:tr>
+      <w:tr>
+        <w:tc>
+          <w:tcPr>
+            <w:tcW w:type="dxa" w:w="3500"/>
+            <w:tcBorders>
+              <w:top w:val="single" w:color="CCCCCC" w:sz="1"/>
+              <w:left w:val="single" w:color="CCCCCC" w:sz="1"/>
+              <w:bottom w:val="single" w:color="CCCCCC" w:sz="1"/>
+              <w:right w:val="single" w:color="CCCCCC" w:sz="1"/>
+            </w:tcBorders>
+            <w:tcMar>
+              <w:top w:type="dxa" w:w="60"/>
+              <w:left w:type="dxa" w:w="100"/>
+              <w:bottom w:type="dxa" w:w="60"/>
+              <w:right w:type="dxa" w:w="100"/>
+            </w:tcMar>
+          </w:tcPr>
+          <w:p>
+            <w:r>
+              <w:rPr>
+                <w:rFonts w:ascii="Arial" w:cs="Arial" w:eastAsia="Arial" w:hAnsi="Arial"/>
+                <w:sz w:val="20"/>
+                <w:szCs w:val="20"/>
+              </w:rPr>
+              <w:t xml:space="preserve">private-data/README.md</w:t>
+            </w:r>
+          </w:p>
+        </w:tc>
+        <w:tc>
+          <w:tcPr>
+            <w:tcW w:type="dxa" w:w="1500"/>
+            <w:tcBorders>
+              <w:top w:val="single" w:color="CCCCCC" w:sz="1"/>
+              <w:left w:val="single" w:color="CCCCCC" w:sz="1"/>
+              <w:bottom w:val="single" w:color="CCCCCC" w:sz="1"/>
+              <w:right w:val="single" w:color="CCCCCC" w:sz="1"/>
+            </w:tcBorders>
+            <w:tcMar>
+              <w:top w:type="dxa" w:w="60"/>
+              <w:left w:type="dxa" w:w="100"/>
+              <w:bottom w:type="dxa" w:w="60"/>
+              <w:right w:type="dxa" w:w="100"/>
+            </w:tcMar>
+          </w:tcPr>
+          <w:p>
+            <w:r>
+              <w:rPr>
+                <w:rFonts w:ascii="Arial" w:cs="Arial" w:eastAsia="Arial" w:hAnsi="Arial"/>
+                <w:sz w:val="20"/>
+                <w:szCs w:val="20"/>
+              </w:rPr>
+              <w:t xml:space="preserve">说明</w:t>
+            </w:r>
+          </w:p>
+        </w:tc>
+        <w:tc>
+          <w:tcPr>
+            <w:tcW w:type="dxa" w:w="4026"/>
+            <w:tcBorders>
+              <w:top w:val="single" w:color="CCCCCC" w:sz="1"/>
+              <w:left w:val="single" w:color="CCCCCC" w:sz="1"/>
+              <w:bottom w:val="single" w:color="CCCCCC" w:sz="1"/>
+              <w:right w:val="single" w:color="CCCCCC" w:sz="1"/>
+            </w:tcBorders>
+            <w:tcMar>
+              <w:top w:type="dxa" w:w="60"/>
+              <w:left w:type="dxa" w:w="100"/>
+              <w:bottom w:type="dxa" w:w="60"/>
+              <w:right w:type="dxa" w:w="100"/>
+            </w:tcMar>
+          </w:tcPr>
+          <w:p>
+            <w:r>
+              <w:rPr>
+                <w:rFonts w:ascii="Arial" w:cs="Arial" w:eastAsia="Arial" w:hAnsi="Arial"/>
+                <w:sz w:val="20"/>
+                <w:szCs w:val="20"/>
+              </w:rPr>
+              <w:t xml:space="preserve">内部数据目录说明</w:t>
+            </w:r>
+          </w:p>
+        </w:tc>
+      </w:tr>
+      <w:tr>
+        <w:tc>
+          <w:tcPr>
+            <w:tcW w:type="dxa" w:w="3500"/>
+            <w:tcBorders>
+              <w:top w:val="single" w:color="CCCCCC" w:sz="1"/>
+              <w:left w:val="single" w:color="CCCCCC" w:sz="1"/>
+              <w:bottom w:val="single" w:color="CCCCCC" w:sz="1"/>
+              <w:right w:val="single" w:color="CCCCCC" w:sz="1"/>
+            </w:tcBorders>
+            <w:tcMar>
+              <w:top w:type="dxa" w:w="60"/>
+              <w:left w:type="dxa" w:w="100"/>
+              <w:bottom w:type="dxa" w:w="60"/>
+              <w:right w:type="dxa" w:w="100"/>
+            </w:tcMar>
+          </w:tcPr>
+          <w:p>
+            <w:r>
+              <w:rPr>
+                <w:rFonts w:ascii="Arial" w:cs="Arial" w:eastAsia="Arial" w:hAnsi="Arial"/>
+                <w:sz w:val="20"/>
+                <w:szCs w:val="20"/>
+              </w:rPr>
+              <w:t xml:space="preserve">private-data/ui-reference/README.md</w:t>
+            </w:r>
+          </w:p>
+        </w:tc>
+        <w:tc>
+          <w:tcPr>
+            <w:tcW w:type="dxa" w:w="1500"/>
+            <w:tcBorders>
+              <w:top w:val="single" w:color="CCCCCC" w:sz="1"/>
+              <w:left w:val="single" w:color="CCCCCC" w:sz="1"/>
+              <w:bottom w:val="single" w:color="CCCCCC" w:sz="1"/>
+              <w:right w:val="single" w:color="CCCCCC" w:sz="1"/>
+            </w:tcBorders>
+            <w:tcMar>
+              <w:top w:type="dxa" w:w="60"/>
+              <w:left w:type="dxa" w:w="100"/>
+              <w:bottom w:type="dxa" w:w="60"/>
+              <w:right w:type="dxa" w:w="100"/>
+            </w:tcMar>
+          </w:tcPr>
+          <w:p>
+            <w:r>
+              <w:rPr>
+                <w:rFonts w:ascii="Arial" w:cs="Arial" w:eastAsia="Arial" w:hAnsi="Arial"/>
+                <w:sz w:val="20"/>
+                <w:szCs w:val="20"/>
+              </w:rPr>
+              <w:t xml:space="preserve">说明</w:t>
+            </w:r>
+          </w:p>
+        </w:tc>
+        <w:tc>
+          <w:tcPr>
+            <w:tcW w:type="dxa" w:w="4026"/>
+            <w:tcBorders>
+              <w:top w:val="single" w:color="CCCCCC" w:sz="1"/>
+              <w:left w:val="single" w:color="CCCCCC" w:sz="1"/>
+              <w:bottom w:val="single" w:color="CCCCCC" w:sz="1"/>
+              <w:right w:val="single" w:color="CCCCCC" w:sz="1"/>
+            </w:tcBorders>
+            <w:tcMar>
+              <w:top w:type="dxa" w:w="60"/>
+              <w:left w:type="dxa" w:w="100"/>
+              <w:bottom w:type="dxa" w:w="60"/>
+              <w:right w:type="dxa" w:w="100"/>
+            </w:tcMar>
+          </w:tcPr>
+          <w:p>
+            <w:r>
+              <w:rPr>
+                <w:rFonts w:ascii="Arial" w:cs="Arial" w:eastAsia="Arial" w:hAnsi="Arial"/>
+                <w:sz w:val="20"/>
+                <w:szCs w:val="20"/>
+              </w:rPr>
+              <w:t xml:space="preserve">UI 参考图存放说明</w:t>
+            </w:r>
+          </w:p>
+        </w:tc>
+      </w:tr>
+    </w:tbl>
+    <w:p>
+      <w:pPr>
+        <w:pStyle w:val="Heading2"/>
+      </w:pPr>
+      <w:r>
+        <w:t xml:space="preserve">十、UI 设计方向确认</w:t>
+      </w:r>
+    </w:p>
+    <w:p>
+      <w:pPr>
+        <w:spacing w:after="60"/>
+      </w:pPr>
+      <w:r>
+        <w:rPr>
+          <w:rFonts w:ascii="Arial" w:cs="Arial" w:eastAsia="Arial" w:hAnsi="Arial"/>
+          <w:sz w:val="20"/>
+          <w:szCs w:val="20"/>
+        </w:rPr>
+        <w:t xml:space="preserve">参考 Task Management Web App UI Kit，借鉴 Linear/Notion/Stripe 风格。</w:t>
+      </w:r>
+    </w:p>
+    <w:p>
+      <w:pPr>
+        <w:pStyle w:val="Heading3"/>
+      </w:pPr>
+      <w:r>
+        <w:t xml:space="preserve">招聘业务映射</w:t>
+      </w:r>
+    </w:p>
+    <w:tbl>
+      <w:tblPr>
+        <w:tblW w:type="dxa" w:w="9026"/>
+        <w:tblBorders>
+          <w:top w:val="single" w:color="auto" w:sz="4"/>
+          <w:left w:val="single" w:color="auto" w:sz="4"/>
+          <w:bottom w:val="single" w:color="auto" w:sz="4"/>
+          <w:right w:val="single" w:color="auto" w:sz="4"/>
+          <w:insideH w:val="single" w:color="auto" w:sz="4"/>
+          <w:insideV w:val="single" w:color="auto" w:sz="4"/>
+        </w:tblBorders>
+      </w:tblPr>
+      <w:tblGrid>
+        <w:gridCol w:w="3500"/>
+        <w:gridCol w:w="5526"/>
+      </w:tblGrid>
+      <w:tr>
+        <w:tc>
+          <w:tcPr>
+            <w:tcW w:type="dxa" w:w="3500"/>
+            <w:tcBorders>
+              <w:top w:val="single" w:color="CCCCCC" w:sz="1"/>
+              <w:left w:val="single" w:color="CCCCCC" w:sz="1"/>
+              <w:bottom w:val="single" w:color="CCCCCC" w:sz="1"/>
+              <w:right w:val="single" w:color="CCCCCC" w:sz="1"/>
+            </w:tcBorders>
+            <w:shd w:fill="2563eb" w:val="clear"/>
+            <w:tcMar>
+              <w:top w:type="dxa" w:w="60"/>
+              <w:left w:type="dxa" w:w="100"/>
+              <w:bottom w:type="dxa" w:w="60"/>
+              <w:right w:type="dxa" w:w="100"/>
+            </w:tcMar>
+          </w:tcPr>
+          <w:p>
+            <w:r>
+              <w:rPr>
+                <w:rFonts w:ascii="Arial" w:cs="Arial" w:eastAsia="Arial" w:hAnsi="Arial"/>
+                <w:b/>
+                <w:bCs/>
+                <w:color w:val="FFFFFF"/>
+                <w:sz w:val="20"/>
+                <w:szCs w:val="20"/>
+              </w:rPr>
+              <w:t xml:space="preserve">参考设计特征</w:t>
+            </w:r>
+          </w:p>
+        </w:tc>
+        <w:tc>
+          <w:tcPr>
+            <w:tcW w:type="dxa" w:w="5526"/>
+            <w:tcBorders>
+              <w:top w:val="single" w:color="CCCCCC" w:sz="1"/>
+              <w:left w:val="single" w:color="CCCCCC" w:sz="1"/>
+              <w:bottom w:val="single" w:color="CCCCCC" w:sz="1"/>
+              <w:right w:val="single" w:color="CCCCCC" w:sz="1"/>
+            </w:tcBorders>
+            <w:shd w:fill="2563eb" w:val="clear"/>
+            <w:tcMar>
+              <w:top w:type="dxa" w:w="60"/>
+              <w:left w:type="dxa" w:w="100"/>
+              <w:bottom w:type="dxa" w:w="60"/>
+              <w:right w:type="dxa" w:w="100"/>
+            </w:tcMar>
+          </w:tcPr>
+          <w:p>
+            <w:r>
+              <w:rPr>
+                <w:rFonts w:ascii="Arial" w:cs="Arial" w:eastAsia="Arial" w:hAnsi="Arial"/>
+                <w:b/>
+                <w:bCs/>
+                <w:color w:val="FFFFFF"/>
+                <w:sz w:val="20"/>
+                <w:szCs w:val="20"/>
+              </w:rPr>
+              <w:t xml:space="preserve">招聘系统落地</w:t>
+            </w:r>
+          </w:p>
+        </w:tc>
+      </w:tr>
+      <w:tr>
+        <w:tc>
+          <w:tcPr>
+            <w:tcW w:type="dxa" w:w="3500"/>
+            <w:tcBorders>
+              <w:top w:val="single" w:color="CCCCCC" w:sz="1"/>
+              <w:left w:val="single" w:color="CCCCCC" w:sz="1"/>
+              <w:bottom w:val="single" w:color="CCCCCC" w:sz="1"/>
+              <w:right w:val="single" w:color="CCCCCC" w:sz="1"/>
+            </w:tcBorders>
+            <w:tcMar>
+              <w:top w:type="dxa" w:w="60"/>
+              <w:left w:type="dxa" w:w="100"/>
+              <w:bottom w:type="dxa" w:w="60"/>
+              <w:right w:type="dxa" w:w="100"/>
+            </w:tcMar>
+          </w:tcPr>
+          <w:p>
+            <w:r>
+              <w:rPr>
+                <w:rFonts w:ascii="Arial" w:cs="Arial" w:eastAsia="Arial" w:hAnsi="Arial"/>
+                <w:sz w:val="20"/>
+                <w:szCs w:val="20"/>
+              </w:rPr>
+              <w:t xml:space="preserve">Task Home</w:t>
+            </w:r>
+          </w:p>
+        </w:tc>
+        <w:tc>
+          <w:tcPr>
+            <w:tcW w:type="dxa" w:w="5526"/>
+            <w:tcBorders>
+              <w:top w:val="single" w:color="CCCCCC" w:sz="1"/>
+              <w:left w:val="single" w:color="CCCCCC" w:sz="1"/>
+              <w:bottom w:val="single" w:color="CCCCCC" w:sz="1"/>
+              <w:right w:val="single" w:color="CCCCCC" w:sz="1"/>
+            </w:tcBorders>
+            <w:tcMar>
+              <w:top w:type="dxa" w:w="60"/>
+              <w:left w:type="dxa" w:w="100"/>
+              <w:bottom w:type="dxa" w:w="60"/>
+              <w:right w:type="dxa" w:w="100"/>
+            </w:tcMar>
+          </w:tcPr>
+          <w:p>
+            <w:r>
+              <w:rPr>
+                <w:rFonts w:ascii="Arial" w:cs="Arial" w:eastAsia="Arial" w:hAnsi="Arial"/>
+                <w:sz w:val="20"/>
+                <w:szCs w:val="20"/>
+              </w:rPr>
+              <w:t xml:space="preserve">招聘工作台 / Workbench</w:t>
+            </w:r>
+          </w:p>
+        </w:tc>
+      </w:tr>
+      <w:tr>
+        <w:tc>
+          <w:tcPr>
+            <w:tcW w:type="dxa" w:w="3500"/>
+            <w:tcBorders>
+              <w:top w:val="single" w:color="CCCCCC" w:sz="1"/>
+              <w:left w:val="single" w:color="CCCCCC" w:sz="1"/>
+              <w:bottom w:val="single" w:color="CCCCCC" w:sz="1"/>
+              <w:right w:val="single" w:color="CCCCCC" w:sz="1"/>
+            </w:tcBorders>
+            <w:tcMar>
+              <w:top w:type="dxa" w:w="60"/>
+              <w:left w:type="dxa" w:w="100"/>
+              <w:bottom w:type="dxa" w:w="60"/>
+              <w:right w:type="dxa" w:w="100"/>
+            </w:tcMar>
+          </w:tcPr>
+          <w:p>
+            <w:r>
+              <w:rPr>
+                <w:rFonts w:ascii="Arial" w:cs="Arial" w:eastAsia="Arial" w:hAnsi="Arial"/>
+                <w:sz w:val="20"/>
+                <w:szCs w:val="20"/>
+              </w:rPr>
+              <w:t xml:space="preserve">Dashboard</w:t>
+            </w:r>
+          </w:p>
+        </w:tc>
+        <w:tc>
+          <w:tcPr>
+            <w:tcW w:type="dxa" w:w="5526"/>
+            <w:tcBorders>
+              <w:top w:val="single" w:color="CCCCCC" w:sz="1"/>
+              <w:left w:val="single" w:color="CCCCCC" w:sz="1"/>
+              <w:bottom w:val="single" w:color="CCCCCC" w:sz="1"/>
+              <w:right w:val="single" w:color="CCCCCC" w:sz="1"/>
+            </w:tcBorders>
+            <w:tcMar>
+              <w:top w:type="dxa" w:w="60"/>
+              <w:left w:type="dxa" w:w="100"/>
+              <w:bottom w:type="dxa" w:w="60"/>
+              <w:right w:type="dxa" w:w="100"/>
+            </w:tcMar>
+          </w:tcPr>
+          <w:p>
+            <w:r>
+              <w:rPr>
+                <w:rFonts w:ascii="Arial" w:cs="Arial" w:eastAsia="Arial" w:hAnsi="Arial"/>
+                <w:sz w:val="20"/>
+                <w:szCs w:val="20"/>
+              </w:rPr>
+              <w:t xml:space="preserve">招聘效率看板</w:t>
+            </w:r>
+          </w:p>
+        </w:tc>
+      </w:tr>
+      <w:tr>
+        <w:tc>
+          <w:tcPr>
+            <w:tcW w:type="dxa" w:w="3500"/>
+            <w:tcBorders>
+              <w:top w:val="single" w:color="CCCCCC" w:sz="1"/>
+              <w:left w:val="single" w:color="CCCCCC" w:sz="1"/>
+              <w:bottom w:val="single" w:color="CCCCCC" w:sz="1"/>
+              <w:right w:val="single" w:color="CCCCCC" w:sz="1"/>
+            </w:tcBorders>
+            <w:tcMar>
+              <w:top w:type="dxa" w:w="60"/>
+              <w:left w:type="dxa" w:w="100"/>
+              <w:bottom w:type="dxa" w:w="60"/>
+              <w:right w:type="dxa" w:w="100"/>
+            </w:tcMar>
+          </w:tcPr>
+          <w:p>
+            <w:r>
+              <w:rPr>
+                <w:rFonts w:ascii="Arial" w:cs="Arial" w:eastAsia="Arial" w:hAnsi="Arial"/>
+                <w:sz w:val="20"/>
+                <w:szCs w:val="20"/>
+              </w:rPr>
+              <w:t xml:space="preserve">Teams</w:t>
+            </w:r>
+          </w:p>
+        </w:tc>
+        <w:tc>
+          <w:tcPr>
+            <w:tcW w:type="dxa" w:w="5526"/>
+            <w:tcBorders>
+              <w:top w:val="single" w:color="CCCCCC" w:sz="1"/>
+              <w:left w:val="single" w:color="CCCCCC" w:sz="1"/>
+              <w:bottom w:val="single" w:color="CCCCCC" w:sz="1"/>
+              <w:right w:val="single" w:color="CCCCCC" w:sz="1"/>
+            </w:tcBorders>
+            <w:tcMar>
+              <w:top w:type="dxa" w:w="60"/>
+              <w:left w:type="dxa" w:w="100"/>
+              <w:bottom w:type="dxa" w:w="60"/>
+              <w:right w:type="dxa" w:w="100"/>
+            </w:tcMar>
+          </w:tcPr>
+          <w:p>
+            <w:r>
+              <w:rPr>
+                <w:rFonts w:ascii="Arial" w:cs="Arial" w:eastAsia="Arial" w:hAnsi="Arial"/>
+                <w:sz w:val="20"/>
+                <w:szCs w:val="20"/>
+              </w:rPr>
+              <w:t xml:space="preserve">部门 / 角色管理</w:t>
+            </w:r>
+          </w:p>
+        </w:tc>
+      </w:tr>
+      <w:tr>
+        <w:tc>
+          <w:tcPr>
+            <w:tcW w:type="dxa" w:w="3500"/>
+            <w:tcBorders>
+              <w:top w:val="single" w:color="CCCCCC" w:sz="1"/>
+              <w:left w:val="single" w:color="CCCCCC" w:sz="1"/>
+              <w:bottom w:val="single" w:color="CCCCCC" w:sz="1"/>
+              <w:right w:val="single" w:color="CCCCCC" w:sz="1"/>
+            </w:tcBorders>
+            <w:tcMar>
+              <w:top w:type="dxa" w:w="60"/>
+              <w:left w:type="dxa" w:w="100"/>
+              <w:bottom w:type="dxa" w:w="60"/>
+              <w:right w:type="dxa" w:w="100"/>
+            </w:tcMar>
+          </w:tcPr>
+          <w:p>
+            <w:r>
+              <w:rPr>
+                <w:rFonts w:ascii="Arial" w:cs="Arial" w:eastAsia="Arial" w:hAnsi="Arial"/>
+                <w:sz w:val="20"/>
+                <w:szCs w:val="20"/>
+              </w:rPr>
+              <w:t xml:space="preserve">Boards</w:t>
+            </w:r>
+          </w:p>
+        </w:tc>
+        <w:tc>
+          <w:tcPr>
+            <w:tcW w:type="dxa" w:w="5526"/>
+            <w:tcBorders>
+              <w:top w:val="single" w:color="CCCCCC" w:sz="1"/>
+              <w:left w:val="single" w:color="CCCCCC" w:sz="1"/>
+              <w:bottom w:val="single" w:color="CCCCCC" w:sz="1"/>
+              <w:right w:val="single" w:color="CCCCCC" w:sz="1"/>
+            </w:tcBorders>
+            <w:tcMar>
+              <w:top w:type="dxa" w:w="60"/>
+              <w:left w:type="dxa" w:w="100"/>
+              <w:bottom w:type="dxa" w:w="60"/>
+              <w:right w:type="dxa" w:w="100"/>
+            </w:tcMar>
+          </w:tcPr>
+          <w:p>
+            <w:r>
+              <w:rPr>
+                <w:rFonts w:ascii="Arial" w:cs="Arial" w:eastAsia="Arial" w:hAnsi="Arial"/>
+                <w:sz w:val="20"/>
+                <w:szCs w:val="20"/>
+              </w:rPr>
+              <w:t xml:space="preserve">岗位管理</w:t>
+            </w:r>
+          </w:p>
+        </w:tc>
+      </w:tr>
+      <w:tr>
+        <w:tc>
+          <w:tcPr>
+            <w:tcW w:type="dxa" w:w="3500"/>
+            <w:tcBorders>
+              <w:top w:val="single" w:color="CCCCCC" w:sz="1"/>
+              <w:left w:val="single" w:color="CCCCCC" w:sz="1"/>
+              <w:bottom w:val="single" w:color="CCCCCC" w:sz="1"/>
+              <w:right w:val="single" w:color="CCCCCC" w:sz="1"/>
+            </w:tcBorders>
+            <w:tcMar>
+              <w:top w:type="dxa" w:w="60"/>
+              <w:left w:type="dxa" w:w="100"/>
+              <w:bottom w:type="dxa" w:w="60"/>
+              <w:right w:type="dxa" w:w="100"/>
+            </w:tcMar>
+          </w:tcPr>
+          <w:p>
+            <w:r>
+              <w:rPr>
+                <w:rFonts w:ascii="Arial" w:cs="Arial" w:eastAsia="Arial" w:hAnsi="Arial"/>
+                <w:sz w:val="20"/>
+                <w:szCs w:val="20"/>
+              </w:rPr>
+              <w:t xml:space="preserve">Inbox</w:t>
+            </w:r>
+          </w:p>
+        </w:tc>
+        <w:tc>
+          <w:tcPr>
+            <w:tcW w:type="dxa" w:w="5526"/>
+            <w:tcBorders>
+              <w:top w:val="single" w:color="CCCCCC" w:sz="1"/>
+              <w:left w:val="single" w:color="CCCCCC" w:sz="1"/>
+              <w:bottom w:val="single" w:color="CCCCCC" w:sz="1"/>
+              <w:right w:val="single" w:color="CCCCCC" w:sz="1"/>
+            </w:tcBorders>
+            <w:tcMar>
+              <w:top w:type="dxa" w:w="60"/>
+              <w:left w:type="dxa" w:w="100"/>
+              <w:bottom w:type="dxa" w:w="60"/>
+              <w:right w:type="dxa" w:w="100"/>
+            </w:tcMar>
+          </w:tcPr>
+          <w:p>
+            <w:r>
+              <w:rPr>
+                <w:rFonts w:ascii="Arial" w:cs="Arial" w:eastAsia="Arial" w:hAnsi="Arial"/>
+                <w:sz w:val="20"/>
+                <w:szCs w:val="20"/>
+              </w:rPr>
+              <w:t xml:space="preserve">待处理事项 / Action Center</w:t>
+            </w:r>
+          </w:p>
+        </w:tc>
+      </w:tr>
+      <w:tr>
+        <w:tc>
+          <w:tcPr>
+            <w:tcW w:type="dxa" w:w="3500"/>
+            <w:tcBorders>
+              <w:top w:val="single" w:color="CCCCCC" w:sz="1"/>
+              <w:left w:val="single" w:color="CCCCCC" w:sz="1"/>
+              <w:bottom w:val="single" w:color="CCCCCC" w:sz="1"/>
+              <w:right w:val="single" w:color="CCCCCC" w:sz="1"/>
+            </w:tcBorders>
+            <w:tcMar>
+              <w:top w:type="dxa" w:w="60"/>
+              <w:left w:type="dxa" w:w="100"/>
+              <w:bottom w:type="dxa" w:w="60"/>
+              <w:right w:type="dxa" w:w="100"/>
+            </w:tcMar>
+          </w:tcPr>
+          <w:p>
+            <w:r>
+              <w:rPr>
+                <w:rFonts w:ascii="Arial" w:cs="Arial" w:eastAsia="Arial" w:hAnsi="Arial"/>
+                <w:sz w:val="20"/>
+                <w:szCs w:val="20"/>
+              </w:rPr>
+              <w:t xml:space="preserve">Task Card</w:t>
+            </w:r>
+          </w:p>
+        </w:tc>
+        <w:tc>
+          <w:tcPr>
+            <w:tcW w:type="dxa" w:w="5526"/>
+            <w:tcBorders>
+              <w:top w:val="single" w:color="CCCCCC" w:sz="1"/>
+              <w:left w:val="single" w:color="CCCCCC" w:sz="1"/>
+              <w:bottom w:val="single" w:color="CCCCCC" w:sz="1"/>
+              <w:right w:val="single" w:color="CCCCCC" w:sz="1"/>
+            </w:tcBorders>
+            <w:tcMar>
+              <w:top w:type="dxa" w:w="60"/>
+              <w:left w:type="dxa" w:w="100"/>
+              <w:bottom w:type="dxa" w:w="60"/>
+              <w:right w:type="dxa" w:w="100"/>
+            </w:tcMar>
+          </w:tcPr>
+          <w:p>
+            <w:r>
+              <w:rPr>
+                <w:rFonts w:ascii="Arial" w:cs="Arial" w:eastAsia="Arial" w:hAnsi="Arial"/>
+                <w:sz w:val="20"/>
+                <w:szCs w:val="20"/>
+              </w:rPr>
+              <w:t xml:space="preserve">ActionItem</w:t>
+            </w:r>
+          </w:p>
+        </w:tc>
+      </w:tr>
+      <w:tr>
+        <w:tc>
+          <w:tcPr>
+            <w:tcW w:type="dxa" w:w="3500"/>
+            <w:tcBorders>
+              <w:top w:val="single" w:color="CCCCCC" w:sz="1"/>
+              <w:left w:val="single" w:color="CCCCCC" w:sz="1"/>
+              <w:bottom w:val="single" w:color="CCCCCC" w:sz="1"/>
+              <w:right w:val="single" w:color="CCCCCC" w:sz="1"/>
+            </w:tcBorders>
+            <w:tcMar>
+              <w:top w:type="dxa" w:w="60"/>
+              <w:left w:type="dxa" w:w="100"/>
+              <w:bottom w:type="dxa" w:w="60"/>
+              <w:right w:type="dxa" w:w="100"/>
+            </w:tcMar>
+          </w:tcPr>
+          <w:p>
+            <w:r>
+              <w:rPr>
+                <w:rFonts w:ascii="Arial" w:cs="Arial" w:eastAsia="Arial" w:hAnsi="Arial"/>
+                <w:sz w:val="20"/>
+                <w:szCs w:val="20"/>
+              </w:rPr>
+              <w:t xml:space="preserve">Timeline</w:t>
+            </w:r>
+          </w:p>
+        </w:tc>
+        <w:tc>
+          <w:tcPr>
+            <w:tcW w:type="dxa" w:w="5526"/>
+            <w:tcBorders>
+              <w:top w:val="single" w:color="CCCCCC" w:sz="1"/>
+              <w:left w:val="single" w:color="CCCCCC" w:sz="1"/>
+              <w:bottom w:val="single" w:color="CCCCCC" w:sz="1"/>
+              <w:right w:val="single" w:color="CCCCCC" w:sz="1"/>
+            </w:tcBorders>
+            <w:tcMar>
+              <w:top w:type="dxa" w:w="60"/>
+              <w:left w:type="dxa" w:w="100"/>
+              <w:bottom w:type="dxa" w:w="60"/>
+              <w:right w:type="dxa" w:w="100"/>
+            </w:tcMar>
+          </w:tcPr>
+          <w:p>
+            <w:r>
+              <w:rPr>
+                <w:rFonts w:ascii="Arial" w:cs="Arial" w:eastAsia="Arial" w:hAnsi="Arial"/>
+                <w:sz w:val="20"/>
+                <w:szCs w:val="20"/>
+              </w:rPr>
+              <w:t xml:space="preserve">招聘动态 / ActivityLog</w:t>
+            </w:r>
+          </w:p>
+        </w:tc>
+      </w:tr>
+      <w:tr>
+        <w:tc>
+          <w:tcPr>
+            <w:tcW w:type="dxa" w:w="3500"/>
+            <w:tcBorders>
+              <w:top w:val="single" w:color="CCCCCC" w:sz="1"/>
+              <w:left w:val="single" w:color="CCCCCC" w:sz="1"/>
+              <w:bottom w:val="single" w:color="CCCCCC" w:sz="1"/>
+              <w:right w:val="single" w:color="CCCCCC" w:sz="1"/>
+            </w:tcBorders>
+            <w:tcMar>
+              <w:top w:type="dxa" w:w="60"/>
+              <w:left w:type="dxa" w:w="100"/>
+              <w:bottom w:type="dxa" w:w="60"/>
+              <w:right w:type="dxa" w:w="100"/>
+            </w:tcMar>
+          </w:tcPr>
+          <w:p>
+            <w:r>
+              <w:rPr>
+                <w:rFonts w:ascii="Arial" w:cs="Arial" w:eastAsia="Arial" w:hAnsi="Arial"/>
+                <w:sz w:val="20"/>
+                <w:szCs w:val="20"/>
+              </w:rPr>
+              <w:t xml:space="preserve">Announcement</w:t>
+            </w:r>
+          </w:p>
+        </w:tc>
+        <w:tc>
+          <w:tcPr>
+            <w:tcW w:type="dxa" w:w="5526"/>
+            <w:tcBorders>
+              <w:top w:val="single" w:color="CCCCCC" w:sz="1"/>
+              <w:left w:val="single" w:color="CCCCCC" w:sz="1"/>
+              <w:bottom w:val="single" w:color="CCCCCC" w:sz="1"/>
+              <w:right w:val="single" w:color="CCCCCC" w:sz="1"/>
+            </w:tcBorders>
+            <w:tcMar>
+              <w:top w:type="dxa" w:w="60"/>
+              <w:left w:type="dxa" w:w="100"/>
+              <w:bottom w:type="dxa" w:w="60"/>
+              <w:right w:type="dxa" w:w="100"/>
+            </w:tcMar>
+          </w:tcPr>
+          <w:p>
+            <w:r>
+              <w:rPr>
+                <w:rFonts w:ascii="Arial" w:cs="Arial" w:eastAsia="Arial" w:hAnsi="Arial"/>
+                <w:sz w:val="20"/>
+                <w:szCs w:val="20"/>
+              </w:rPr>
+              <w:t xml:space="preserve">风险提醒 / 面试质量提醒</w:t>
+            </w:r>
+          </w:p>
+        </w:tc>
+      </w:tr>
+      <w:tr>
+        <w:tc>
+          <w:tcPr>
+            <w:tcW w:type="dxa" w:w="3500"/>
+            <w:tcBorders>
+              <w:top w:val="single" w:color="CCCCCC" w:sz="1"/>
+              <w:left w:val="single" w:color="CCCCCC" w:sz="1"/>
+              <w:bottom w:val="single" w:color="CCCCCC" w:sz="1"/>
+              <w:right w:val="single" w:color="CCCCCC" w:sz="1"/>
+            </w:tcBorders>
+            <w:tcMar>
+              <w:top w:type="dxa" w:w="60"/>
+              <w:left w:type="dxa" w:w="100"/>
+              <w:bottom w:type="dxa" w:w="60"/>
+              <w:right w:type="dxa" w:w="100"/>
+            </w:tcMar>
+          </w:tcPr>
+          <w:p>
+            <w:r>
+              <w:rPr>
+                <w:rFonts w:ascii="Arial" w:cs="Arial" w:eastAsia="Arial" w:hAnsi="Arial"/>
+                <w:sz w:val="20"/>
+                <w:szCs w:val="20"/>
+              </w:rPr>
+              <w:t xml:space="preserve">Popup</w:t>
+            </w:r>
+          </w:p>
+        </w:tc>
+        <w:tc>
+          <w:tcPr>
+            <w:tcW w:type="dxa" w:w="5526"/>
+            <w:tcBorders>
+              <w:top w:val="single" w:color="CCCCCC" w:sz="1"/>
+              <w:left w:val="single" w:color="CCCCCC" w:sz="1"/>
+              <w:bottom w:val="single" w:color="CCCCCC" w:sz="1"/>
+              <w:right w:val="single" w:color="CCCCCC" w:sz="1"/>
+            </w:tcBorders>
+            <w:tcMar>
+              <w:top w:type="dxa" w:w="60"/>
+              <w:left w:type="dxa" w:w="100"/>
+              <w:bottom w:type="dxa" w:w="60"/>
+              <w:right w:type="dxa" w:w="100"/>
+            </w:tcMar>
+          </w:tcPr>
+          <w:p>
+            <w:r>
+              <w:rPr>
+                <w:rFonts w:ascii="Arial" w:cs="Arial" w:eastAsia="Arial" w:hAnsi="Arial"/>
+                <w:sz w:val="20"/>
+                <w:szCs w:val="20"/>
+              </w:rPr>
+              <w:t xml:space="preserve">面试反馈 / 导入确认 / AI 结果确认</w:t>
+            </w:r>
+          </w:p>
+        </w:tc>
+      </w:tr>
+      <w:tr>
+        <w:tc>
+          <w:tcPr>
+            <w:tcW w:type="dxa" w:w="3500"/>
+            <w:tcBorders>
+              <w:top w:val="single" w:color="CCCCCC" w:sz="1"/>
+              <w:left w:val="single" w:color="CCCCCC" w:sz="1"/>
+              <w:bottom w:val="single" w:color="CCCCCC" w:sz="1"/>
+              <w:right w:val="single" w:color="CCCCCC" w:sz="1"/>
+            </w:tcBorders>
+            <w:tcMar>
+              <w:top w:type="dxa" w:w="60"/>
+              <w:left w:type="dxa" w:w="100"/>
+              <w:bottom w:type="dxa" w:w="60"/>
+              <w:right w:type="dxa" w:w="100"/>
+            </w:tcMar>
+          </w:tcPr>
+          <w:p>
+            <w:r>
+              <w:rPr>
+                <w:rFonts w:ascii="Arial" w:cs="Arial" w:eastAsia="Arial" w:hAnsi="Arial"/>
+                <w:sz w:val="20"/>
+                <w:szCs w:val="20"/>
+              </w:rPr>
+              <w:t xml:space="preserve">Detail Panel</w:t>
+            </w:r>
+          </w:p>
+        </w:tc>
+        <w:tc>
+          <w:tcPr>
+            <w:tcW w:type="dxa" w:w="5526"/>
+            <w:tcBorders>
+              <w:top w:val="single" w:color="CCCCCC" w:sz="1"/>
+              <w:left w:val="single" w:color="CCCCCC" w:sz="1"/>
+              <w:bottom w:val="single" w:color="CCCCCC" w:sz="1"/>
+              <w:right w:val="single" w:color="CCCCCC" w:sz="1"/>
+            </w:tcBorders>
+            <w:tcMar>
+              <w:top w:type="dxa" w:w="60"/>
+              <w:left w:type="dxa" w:w="100"/>
+              <w:bottom w:type="dxa" w:w="60"/>
+              <w:right w:type="dxa" w:w="100"/>
+            </w:tcMar>
+          </w:tcPr>
+          <w:p>
+            <w:r>
+              <w:rPr>
+                <w:rFonts w:ascii="Arial" w:cs="Arial" w:eastAsia="Arial" w:hAnsi="Arial"/>
+                <w:sz w:val="20"/>
+                <w:szCs w:val="20"/>
+              </w:rPr>
+              <w:t xml:space="preserve">候选人详情 / 岗位详情 / Offer 风险详情</w:t>
+            </w:r>
+          </w:p>
+        </w:tc>
+      </w:tr>
+    </w:tbl>
+    <w:p>
+      <w:pPr>
+        <w:spacing w:after="60" w:before="100"/>
+      </w:pPr>
+      <w:r>
+        <w:rPr>
+          <w:rFonts w:ascii="Arial" w:cs="Arial" w:eastAsia="Arial" w:hAnsi="Arial"/>
+          <w:sz w:val="20"/>
+          <w:szCs w:val="20"/>
+        </w:rPr>
+        <w:t xml:space="preserve">全局 UI 标准已写入 docs/UI_GUIDELINES.md，后续所有 Phase 必须遵守。</w:t>
+      </w:r>
+    </w:p>
+    <w:p>
+      <w:pPr>
+        <w:pStyle w:val="Heading2"/>
+      </w:pPr>
+      <w:r>
+        <w:t xml:space="preserve">十一、构建验证</w:t>
       </w:r>
     </w:p>
     <w:tbl>
@@ -6383,7 +8689,7 @@
         <w:pStyle w:val="Heading2"/>
       </w:pPr>
       <w:r>
-        <w:t xml:space="preserve">十、Git 验证</w:t>
+        <w:t xml:space="preserve">十二、Git 验证</w:t>
       </w:r>
     </w:p>
     <w:tbl>
@@ -6573,7 +8879,7 @@
                 <w:sz w:val="20"/>
                 <w:szCs w:val="20"/>
               </w:rPr>
-              <w:t xml:space="preserve">82f3ca1</w:t>
+              <w:t xml:space="preserve">e4cc1d5</w:t>
             </w:r>
           </w:p>
         </w:tc>
@@ -6741,7 +9047,7 @@
                 <w:sz w:val="20"/>
                 <w:szCs w:val="20"/>
               </w:rPr>
-              <w:t xml:space="preserve">✅ 已 push (82f3ca1)</w:t>
+              <w:t xml:space="preserve">✅ 已 push (e4cc1d5)</w:t>
             </w:r>
           </w:p>
         </w:tc>
@@ -6770,7 +9076,7 @@
                 <w:sz w:val="20"/>
                 <w:szCs w:val="20"/>
               </w:rPr>
-              <w:t xml:space="preserve">force push</w:t>
+              <w:t xml:space="preserve">是否 force push main</w:t>
             </w:r>
           </w:p>
         </w:tc>
@@ -6797,7 +9103,63 @@
                 <w:sz w:val="20"/>
                 <w:szCs w:val="20"/>
               </w:rPr>
-              <w:t xml:space="preserve">仅用于 tag 更新</w:t>
+              <w:t xml:space="preserve">否</w:t>
+            </w:r>
+          </w:p>
+        </w:tc>
+      </w:tr>
+      <w:tr>
+        <w:tc>
+          <w:tcPr>
+            <w:tcW w:type="dxa" w:w="4000"/>
+            <w:tcBorders>
+              <w:top w:val="single" w:color="CCCCCC" w:sz="1"/>
+              <w:left w:val="single" w:color="CCCCCC" w:sz="1"/>
+              <w:bottom w:val="single" w:color="CCCCCC" w:sz="1"/>
+              <w:right w:val="single" w:color="CCCCCC" w:sz="1"/>
+            </w:tcBorders>
+            <w:tcMar>
+              <w:top w:type="dxa" w:w="60"/>
+              <w:left w:type="dxa" w:w="100"/>
+              <w:bottom w:type="dxa" w:w="60"/>
+              <w:right w:type="dxa" w:w="100"/>
+            </w:tcMar>
+          </w:tcPr>
+          <w:p>
+            <w:r>
+              <w:rPr>
+                <w:rFonts w:ascii="Arial" w:cs="Arial" w:eastAsia="Arial" w:hAnsi="Arial"/>
+                <w:sz w:val="20"/>
+                <w:szCs w:val="20"/>
+              </w:rPr>
+              <w:t xml:space="preserve">是否修改业务代码</w:t>
+            </w:r>
+          </w:p>
+        </w:tc>
+        <w:tc>
+          <w:tcPr>
+            <w:tcW w:type="dxa" w:w="5026"/>
+            <w:tcBorders>
+              <w:top w:val="single" w:color="CCCCCC" w:sz="1"/>
+              <w:left w:val="single" w:color="CCCCCC" w:sz="1"/>
+              <w:bottom w:val="single" w:color="CCCCCC" w:sz="1"/>
+              <w:right w:val="single" w:color="CCCCCC" w:sz="1"/>
+            </w:tcBorders>
+            <w:tcMar>
+              <w:top w:type="dxa" w:w="60"/>
+              <w:left w:type="dxa" w:w="100"/>
+              <w:bottom w:type="dxa" w:w="60"/>
+              <w:right w:type="dxa" w:w="100"/>
+            </w:tcMar>
+          </w:tcPr>
+          <w:p>
+            <w:r>
+              <w:rPr>
+                <w:rFonts w:ascii="Arial" w:cs="Arial" w:eastAsia="Arial" w:hAnsi="Arial"/>
+                <w:sz w:val="20"/>
+                <w:szCs w:val="20"/>
+              </w:rPr>
+              <w:t xml:space="preserve">否（仅权限基础设施）</w:t>
             </w:r>
           </w:p>
         </w:tc>
@@ -6808,7 +9170,7 @@
         <w:pStyle w:val="Heading2"/>
       </w:pPr>
       <w:r>
-        <w:t xml:space="preserve">十一、边界检查</w:t>
+        <w:t xml:space="preserve">十三、边界检查</w:t>
       </w:r>
     </w:p>
     <w:tbl>
@@ -7039,7 +9401,7 @@
                 <w:sz w:val="20"/>
                 <w:szCs w:val="20"/>
               </w:rPr>
-              <w:t xml:space="preserve">是否做 AI 自动决策</w:t>
+              <w:t xml:space="preserve">是否做 Offer 审批</w:t>
             </w:r>
           </w:p>
         </w:tc>
@@ -7100,7 +9462,7 @@
                 <w:sz w:val="20"/>
                 <w:szCs w:val="20"/>
               </w:rPr>
-              <w:t xml:space="preserve">是否自动录用/淘汰</w:t>
+              <w:t xml:space="preserve">是否做 AI 自动决策</w:t>
             </w:r>
           </w:p>
         </w:tc>
@@ -7161,7 +9523,7 @@
                 <w:sz w:val="20"/>
                 <w:szCs w:val="20"/>
               </w:rPr>
-              <w:t xml:space="preserve">是否真实业务数据</w:t>
+              <w:t xml:space="preserve">是否自动录用/淘汰</w:t>
             </w:r>
           </w:p>
         </w:tc>
@@ -7191,6 +9553,67 @@
                 <w:sz w:val="20"/>
                 <w:szCs w:val="20"/>
               </w:rPr>
+              <w:t xml:space="preserve">否</w:t>
+            </w:r>
+          </w:p>
+        </w:tc>
+      </w:tr>
+      <w:tr>
+        <w:tc>
+          <w:tcPr>
+            <w:tcW w:type="dxa" w:w="4513"/>
+            <w:tcBorders>
+              <w:top w:val="single" w:color="CCCCCC" w:sz="1"/>
+              <w:left w:val="single" w:color="CCCCCC" w:sz="1"/>
+              <w:bottom w:val="single" w:color="CCCCCC" w:sz="1"/>
+              <w:right w:val="single" w:color="CCCCCC" w:sz="1"/>
+            </w:tcBorders>
+            <w:tcMar>
+              <w:top w:type="dxa" w:w="60"/>
+              <w:left w:type="dxa" w:w="100"/>
+              <w:bottom w:type="dxa" w:w="60"/>
+              <w:right w:type="dxa" w:w="100"/>
+            </w:tcMar>
+          </w:tcPr>
+          <w:p>
+            <w:r>
+              <w:rPr>
+                <w:rFonts w:ascii="Arial" w:cs="Arial" w:eastAsia="Arial" w:hAnsi="Arial"/>
+                <w:b/>
+                <w:bCs/>
+                <w:sz w:val="20"/>
+                <w:szCs w:val="20"/>
+              </w:rPr>
+              <w:t xml:space="preserve">是否真实业务数据</w:t>
+            </w:r>
+          </w:p>
+        </w:tc>
+        <w:tc>
+          <w:tcPr>
+            <w:tcW w:type="dxa" w:w="4513"/>
+            <w:tcBorders>
+              <w:top w:val="single" w:color="CCCCCC" w:sz="1"/>
+              <w:left w:val="single" w:color="CCCCCC" w:sz="1"/>
+              <w:bottom w:val="single" w:color="CCCCCC" w:sz="1"/>
+              <w:right w:val="single" w:color="CCCCCC" w:sz="1"/>
+            </w:tcBorders>
+            <w:tcMar>
+              <w:top w:type="dxa" w:w="60"/>
+              <w:left w:type="dxa" w:w="100"/>
+              <w:bottom w:type="dxa" w:w="60"/>
+              <w:right w:type="dxa" w:w="100"/>
+            </w:tcMar>
+          </w:tcPr>
+          <w:p>
+            <w:r>
+              <w:rPr>
+                <w:rFonts w:ascii="Arial" w:cs="Arial" w:eastAsia="Arial" w:hAnsi="Arial"/>
+                <w:b/>
+                <w:bCs/>
+                <w:color w:val="dc2626"/>
+                <w:sz w:val="20"/>
+                <w:szCs w:val="20"/>
+              </w:rPr>
               <w:t xml:space="preserve">否（仅规则骨架）</w:t>
             </w:r>
           </w:p>
@@ -7253,6 +9676,67 @@
                 <w:szCs w:val="20"/>
               </w:rPr>
               <w:t xml:space="preserve">否</w:t>
+            </w:r>
+          </w:p>
+        </w:tc>
+      </w:tr>
+      <w:tr>
+        <w:tc>
+          <w:tcPr>
+            <w:tcW w:type="dxa" w:w="4513"/>
+            <w:tcBorders>
+              <w:top w:val="single" w:color="CCCCCC" w:sz="1"/>
+              <w:left w:val="single" w:color="CCCCCC" w:sz="1"/>
+              <w:bottom w:val="single" w:color="CCCCCC" w:sz="1"/>
+              <w:right w:val="single" w:color="CCCCCC" w:sz="1"/>
+            </w:tcBorders>
+            <w:tcMar>
+              <w:top w:type="dxa" w:w="60"/>
+              <w:left w:type="dxa" w:w="100"/>
+              <w:bottom w:type="dxa" w:w="60"/>
+              <w:right w:type="dxa" w:w="100"/>
+            </w:tcMar>
+          </w:tcPr>
+          <w:p>
+            <w:r>
+              <w:rPr>
+                <w:rFonts w:ascii="Arial" w:cs="Arial" w:eastAsia="Arial" w:hAnsi="Arial"/>
+                <w:b/>
+                <w:bCs/>
+                <w:sz w:val="20"/>
+                <w:szCs w:val="20"/>
+              </w:rPr>
+              <w:t xml:space="preserve">是否复制 UI Kit 资产</w:t>
+            </w:r>
+          </w:p>
+        </w:tc>
+        <w:tc>
+          <w:tcPr>
+            <w:tcW w:type="dxa" w:w="4513"/>
+            <w:tcBorders>
+              <w:top w:val="single" w:color="CCCCCC" w:sz="1"/>
+              <w:left w:val="single" w:color="CCCCCC" w:sz="1"/>
+              <w:bottom w:val="single" w:color="CCCCCC" w:sz="1"/>
+              <w:right w:val="single" w:color="CCCCCC" w:sz="1"/>
+            </w:tcBorders>
+            <w:tcMar>
+              <w:top w:type="dxa" w:w="60"/>
+              <w:left w:type="dxa" w:w="100"/>
+              <w:bottom w:type="dxa" w:w="60"/>
+              <w:right w:type="dxa" w:w="100"/>
+            </w:tcMar>
+          </w:tcPr>
+          <w:p>
+            <w:r>
+              <w:rPr>
+                <w:rFonts w:ascii="Arial" w:cs="Arial" w:eastAsia="Arial" w:hAnsi="Arial"/>
+                <w:b/>
+                <w:bCs/>
+                <w:color w:val="dc2626"/>
+                <w:sz w:val="20"/>
+                <w:szCs w:val="20"/>
+              </w:rPr>
+              <w:t xml:space="preserve">否（仅设计方向参考）</w:t>
             </w:r>
           </w:p>
         </w:tc>
@@ -7263,7 +9747,7 @@
         <w:pStyle w:val="Heading2"/>
       </w:pPr>
       <w:r>
-        <w:t xml:space="preserve">十二、已知问题</w:t>
+        <w:t xml:space="preserve">十四、已知问题</w:t>
       </w:r>
     </w:p>
     <w:p>
@@ -7294,10 +9778,23 @@
     </w:p>
     <w:p>
       <w:pPr>
+        <w:pStyle w:val="ListParagraph"/>
+        <w:numPr>
+          <w:ilvl w:val="0"/>
+          <w:numId w:val="2"/>
+        </w:numPr>
+        <w:spacing w:after="40"/>
+      </w:pPr>
+      <w:r>
+        <w:t xml:space="preserve">权限调试页面 /permissions-debug 仅开发环境使用，正式环境应移除</w:t>
+      </w:r>
+    </w:p>
+    <w:p>
+      <w:pPr>
         <w:pStyle w:val="Heading2"/>
       </w:pPr>
       <w:r>
-        <w:t xml:space="preserve">十三、结论</w:t>
+        <w:t xml:space="preserve">十五、结论</w:t>
       </w:r>
     </w:p>
     <w:tbl>
@@ -7337,6 +9834,8 @@
             <w:r>
               <w:rPr>
                 <w:rFonts w:ascii="Arial" w:cs="Arial" w:eastAsia="Arial" w:hAnsi="Arial"/>
+                <w:b/>
+                <w:bCs/>
                 <w:sz w:val="20"/>
                 <w:szCs w:val="20"/>
               </w:rPr>
@@ -7364,10 +9863,13 @@
             <w:r>
               <w:rPr>
                 <w:rFonts w:ascii="Arial" w:cs="Arial" w:eastAsia="Arial" w:hAnsi="Arial"/>
-                <w:sz w:val="20"/>
-                <w:szCs w:val="20"/>
-              </w:rPr>
-              <w:t xml:space="preserve">✅ 是</w:t>
+                <w:b/>
+                <w:bCs/>
+                <w:color w:val="16a34a"/>
+                <w:sz w:val="20"/>
+                <w:szCs w:val="20"/>
+              </w:rPr>
+              <w:t xml:space="preserve">✅ 是 — 所有验收项通过</w:t>
             </w:r>
           </w:p>
         </w:tc>
@@ -7393,6 +9895,8 @@
             <w:r>
               <w:rPr>
                 <w:rFonts w:ascii="Arial" w:cs="Arial" w:eastAsia="Arial" w:hAnsi="Arial"/>
+                <w:b/>
+                <w:bCs/>
                 <w:sz w:val="20"/>
                 <w:szCs w:val="20"/>
               </w:rPr>
@@ -7420,6 +9924,9 @@
             <w:r>
               <w:rPr>
                 <w:rFonts w:ascii="Arial" w:cs="Arial" w:eastAsia="Arial" w:hAnsi="Arial"/>
+                <w:b/>
+                <w:bCs/>
+                <w:color w:val="16a34a"/>
                 <w:sz w:val="20"/>
                 <w:szCs w:val="20"/>
               </w:rPr>
@@ -7449,10 +9956,12 @@
             <w:r>
               <w:rPr>
                 <w:rFonts w:ascii="Arial" w:cs="Arial" w:eastAsia="Arial" w:hAnsi="Arial"/>
-                <w:sz w:val="20"/>
-                <w:szCs w:val="20"/>
-              </w:rPr>
-              <w:t xml:space="preserve">需要外部审查</w:t>
+                <w:b/>
+                <w:bCs/>
+                <w:sz w:val="20"/>
+                <w:szCs w:val="20"/>
+              </w:rPr>
+              <w:t xml:space="preserve">需要外部审查的问题</w:t>
             </w:r>
           </w:p>
         </w:tc>
@@ -7479,7 +9988,9 @@
                 <w:sz w:val="20"/>
                 <w:szCs w:val="20"/>
               </w:rPr>
-              <w:t xml:space="preserve">Role Switcher UI / 权限矩阵粒度</w:t>
+              <w:t xml:space="preserve">1. Role Switcher UI 位置
+2. 权限矩阵粒度
+3. UI 设计方向确认</w:t>
             </w:r>
           </w:p>
         </w:tc>

</xml_diff>